<commit_message>
update FinalReport.docx and AILogs
</commit_message>
<xml_diff>
--- a/FinalReport.docx
+++ b/FinalReport.docx
@@ -396,6 +396,305 @@
     </w:tbl>
     <w:p/>
     <w:p>
+      <w:pPr>
+        <w:pStyle w:val="2"/>
+      </w:pPr>
+      <w:r>
+        <w:t>2.3</w:t>
+      </w:r>
+      <w:r>
+        <w:rPr>
+          <w:lang w:val="en-US"/>
+        </w:rPr>
+        <w:t>. Luồng Xuất Thuốc FEFO</w:t>
+      </w:r>
+    </w:p>
+    <w:p>
+      <w:r>
+        <w:drawing>
+          <wp:inline distT="0" distB="0" distL="114300" distR="114300">
+            <wp:extent cx="3514725" cy="5486400"/>
+            <wp:effectExtent l="0" t="0" r="0" b="0"/>
+            <wp:docPr id="235111257" name="drawing"/>
+            <wp:cNvGraphicFramePr>
+              <a:graphicFrameLocks xmlns:a="http://schemas.openxmlformats.org/drawingml/2006/main" noChangeAspect="1"/>
+            </wp:cNvGraphicFramePr>
+            <a:graphic xmlns:a="http://schemas.openxmlformats.org/drawingml/2006/main">
+              <a:graphicData uri="http://schemas.openxmlformats.org/drawingml/2006/picture">
+                <pic:pic xmlns:pic="http://schemas.openxmlformats.org/drawingml/2006/picture">
+                  <pic:nvPicPr>
+                    <pic:cNvPr id="235111257" name="drawing"/>
+                    <pic:cNvPicPr>
+                      <a:picLocks noChangeAspect="1"/>
+                    </pic:cNvPicPr>
+                  </pic:nvPicPr>
+                  <pic:blipFill>
+                    <a:blip r:embed="rId8"/>
+                    <a:stretch>
+                      <a:fillRect/>
+                    </a:stretch>
+                  </pic:blipFill>
+                  <pic:spPr>
+                    <a:xfrm>
+                      <a:off x="0" y="0"/>
+                      <a:ext cx="3514725" cy="5486400"/>
+                    </a:xfrm>
+                    <a:prstGeom prst="rect">
+                      <a:avLst/>
+                    </a:prstGeom>
+                  </pic:spPr>
+                </pic:pic>
+              </a:graphicData>
+            </a:graphic>
+          </wp:inline>
+        </w:drawing>
+      </w:r>
+    </w:p>
+    <w:p/>
+    <w:p>
+      <w:pPr>
+        <w:pStyle w:val="4"/>
+        <w:rPr>
+          <w:sz w:val="28"/>
+          <w:szCs w:val="28"/>
+        </w:rPr>
+      </w:pPr>
+      <w:r>
+        <w:rPr>
+          <w:sz w:val="28"/>
+          <w:szCs w:val="28"/>
+          <w:lang w:val="en-US"/>
+        </w:rPr>
+        <w:t>2.4</w:t>
+      </w:r>
+      <w:r>
+        <w:rPr>
+          <w:rFonts w:hint="default"/>
+          <w:sz w:val="28"/>
+          <w:szCs w:val="28"/>
+          <w:lang w:val="en-US"/>
+        </w:rPr>
+        <w:t xml:space="preserve"> </w:t>
+      </w:r>
+      <w:r>
+        <w:rPr>
+          <w:sz w:val="28"/>
+          <w:szCs w:val="28"/>
+          <w:lang w:val="en-US"/>
+        </w:rPr>
+        <w:t>Luồng So sánh 4 Cơ chế Khóa</w:t>
+      </w:r>
+    </w:p>
+    <w:p>
+      <w:pPr>
+        <w:pStyle w:val="3"/>
+      </w:pPr>
+    </w:p>
+    <w:p>
+      <w:r>
+        <w:drawing>
+          <wp:inline distT="0" distB="0" distL="114300" distR="114300">
+            <wp:extent cx="5486400" cy="1847850"/>
+            <wp:effectExtent l="0" t="0" r="0" b="0"/>
+            <wp:docPr id="111064819" name="drawing"/>
+            <wp:cNvGraphicFramePr>
+              <a:graphicFrameLocks xmlns:a="http://schemas.openxmlformats.org/drawingml/2006/main" noChangeAspect="1"/>
+            </wp:cNvGraphicFramePr>
+            <a:graphic xmlns:a="http://schemas.openxmlformats.org/drawingml/2006/main">
+              <a:graphicData uri="http://schemas.openxmlformats.org/drawingml/2006/picture">
+                <pic:pic xmlns:pic="http://schemas.openxmlformats.org/drawingml/2006/picture">
+                  <pic:nvPicPr>
+                    <pic:cNvPr id="111064819" name="drawing"/>
+                    <pic:cNvPicPr>
+                      <a:picLocks noChangeAspect="1"/>
+                    </pic:cNvPicPr>
+                  </pic:nvPicPr>
+                  <pic:blipFill>
+                    <a:blip r:embed="rId9"/>
+                    <a:stretch>
+                      <a:fillRect/>
+                    </a:stretch>
+                  </pic:blipFill>
+                  <pic:spPr>
+                    <a:xfrm>
+                      <a:off x="0" y="0"/>
+                      <a:ext cx="5486400" cy="1847850"/>
+                    </a:xfrm>
+                    <a:prstGeom prst="rect">
+                      <a:avLst/>
+                    </a:prstGeom>
+                  </pic:spPr>
+                </pic:pic>
+              </a:graphicData>
+            </a:graphic>
+          </wp:inline>
+        </w:drawing>
+      </w:r>
+    </w:p>
+    <w:p>
+      <w:pPr>
+        <w:pStyle w:val="4"/>
+        <w:rPr>
+          <w:sz w:val="28"/>
+          <w:szCs w:val="28"/>
+        </w:rPr>
+      </w:pPr>
+      <w:r>
+        <w:rPr>
+          <w:sz w:val="28"/>
+          <w:szCs w:val="28"/>
+          <w:lang w:val="en-US"/>
+        </w:rPr>
+        <w:t>2.5</w:t>
+      </w:r>
+      <w:r>
+        <w:rPr>
+          <w:rFonts w:hint="default"/>
+          <w:sz w:val="28"/>
+          <w:szCs w:val="28"/>
+          <w:lang w:val="en-US"/>
+        </w:rPr>
+        <w:t xml:space="preserve"> </w:t>
+      </w:r>
+      <w:r>
+        <w:rPr>
+          <w:sz w:val="28"/>
+          <w:szCs w:val="28"/>
+          <w:lang w:val="en-US"/>
+        </w:rPr>
+        <w:t>Luồng Simulator Tool</w:t>
+      </w:r>
+    </w:p>
+    <w:p>
+      <w:r>
+        <w:drawing>
+          <wp:inline distT="0" distB="0" distL="114300" distR="114300">
+            <wp:extent cx="5486400" cy="619125"/>
+            <wp:effectExtent l="0" t="0" r="0" b="0"/>
+            <wp:docPr id="47648405" name="drawing"/>
+            <wp:cNvGraphicFramePr>
+              <a:graphicFrameLocks xmlns:a="http://schemas.openxmlformats.org/drawingml/2006/main" noChangeAspect="1"/>
+            </wp:cNvGraphicFramePr>
+            <a:graphic xmlns:a="http://schemas.openxmlformats.org/drawingml/2006/main">
+              <a:graphicData uri="http://schemas.openxmlformats.org/drawingml/2006/picture">
+                <pic:pic xmlns:pic="http://schemas.openxmlformats.org/drawingml/2006/picture">
+                  <pic:nvPicPr>
+                    <pic:cNvPr id="47648405" name="drawing"/>
+                    <pic:cNvPicPr>
+                      <a:picLocks noChangeAspect="1"/>
+                    </pic:cNvPicPr>
+                  </pic:nvPicPr>
+                  <pic:blipFill>
+                    <a:blip r:embed="rId10"/>
+                    <a:stretch>
+                      <a:fillRect/>
+                    </a:stretch>
+                  </pic:blipFill>
+                  <pic:spPr>
+                    <a:xfrm>
+                      <a:off x="0" y="0"/>
+                      <a:ext cx="5486400" cy="619125"/>
+                    </a:xfrm>
+                    <a:prstGeom prst="rect">
+                      <a:avLst/>
+                    </a:prstGeom>
+                  </pic:spPr>
+                </pic:pic>
+              </a:graphicData>
+            </a:graphic>
+          </wp:inline>
+        </w:drawing>
+      </w:r>
+    </w:p>
+    <w:p>
+      <w:pPr>
+        <w:pStyle w:val="4"/>
+        <w:rPr>
+          <w:b/>
+          <w:bCs/>
+          <w:sz w:val="28"/>
+          <w:szCs w:val="28"/>
+        </w:rPr>
+      </w:pPr>
+      <w:r>
+        <w:rPr>
+          <w:b/>
+          <w:bCs/>
+          <w:sz w:val="28"/>
+          <w:szCs w:val="28"/>
+          <w:lang w:val="en-US"/>
+        </w:rPr>
+        <w:t>2.6</w:t>
+      </w:r>
+      <w:r>
+        <w:rPr>
+          <w:rFonts w:hint="default"/>
+          <w:b/>
+          <w:bCs/>
+          <w:sz w:val="28"/>
+          <w:szCs w:val="28"/>
+          <w:lang w:val="en-US"/>
+        </w:rPr>
+        <w:t xml:space="preserve"> </w:t>
+      </w:r>
+      <w:r>
+        <w:rPr>
+          <w:b/>
+          <w:bCs/>
+          <w:sz w:val="28"/>
+          <w:szCs w:val="28"/>
+          <w:lang w:val="en-US"/>
+        </w:rPr>
+        <w:t>Luồng Sinh Dữ liệu CSV</w:t>
+      </w:r>
+    </w:p>
+    <w:p>
+      <w:r>
+        <w:drawing>
+          <wp:inline distT="0" distB="0" distL="114300" distR="114300">
+            <wp:extent cx="3819525" cy="5486400"/>
+            <wp:effectExtent l="0" t="0" r="0" b="0"/>
+            <wp:docPr id="533277747" name="drawing"/>
+            <wp:cNvGraphicFramePr>
+              <a:graphicFrameLocks xmlns:a="http://schemas.openxmlformats.org/drawingml/2006/main" noChangeAspect="1"/>
+            </wp:cNvGraphicFramePr>
+            <a:graphic xmlns:a="http://schemas.openxmlformats.org/drawingml/2006/main">
+              <a:graphicData uri="http://schemas.openxmlformats.org/drawingml/2006/picture">
+                <pic:pic xmlns:pic="http://schemas.openxmlformats.org/drawingml/2006/picture">
+                  <pic:nvPicPr>
+                    <pic:cNvPr id="533277747" name="drawing"/>
+                    <pic:cNvPicPr>
+                      <a:picLocks noChangeAspect="1"/>
+                    </pic:cNvPicPr>
+                  </pic:nvPicPr>
+                  <pic:blipFill>
+                    <a:blip r:embed="rId11"/>
+                    <a:stretch>
+                      <a:fillRect/>
+                    </a:stretch>
+                  </pic:blipFill>
+                  <pic:spPr>
+                    <a:xfrm>
+                      <a:off x="0" y="0"/>
+                      <a:ext cx="3819525" cy="5486400"/>
+                    </a:xfrm>
+                    <a:prstGeom prst="rect">
+                      <a:avLst/>
+                    </a:prstGeom>
+                  </pic:spPr>
+                </pic:pic>
+              </a:graphicData>
+            </a:graphic>
+          </wp:inline>
+        </w:drawing>
+      </w:r>
+    </w:p>
+    <w:p>
+      <w:pPr>
+        <w:pStyle w:val="2"/>
+      </w:pPr>
+    </w:p>
+    <w:p>
       <w:r>
         <w:rPr>
           <w:b/>
@@ -508,7 +807,7 @@
                           </pic:cNvPicPr>
                         </pic:nvPicPr>
                         <pic:blipFill>
-                          <a:blip r:embed="rId8"/>
+                          <a:blip r:embed="rId12"/>
                           <a:stretch>
                             <a:fillRect/>
                           </a:stretch>
@@ -631,7 +930,7 @@
                           </pic:cNvPicPr>
                         </pic:nvPicPr>
                         <pic:blipFill>
-                          <a:blip r:embed="rId9"/>
+                          <a:blip r:embed="rId13"/>
                           <a:stretch>
                             <a:fillRect/>
                           </a:stretch>
@@ -754,7 +1053,7 @@
                           </pic:cNvPicPr>
                         </pic:nvPicPr>
                         <pic:blipFill>
-                          <a:blip r:embed="rId10"/>
+                          <a:blip r:embed="rId14"/>
                           <a:stretch>
                             <a:fillRect/>
                           </a:stretch>
@@ -851,7 +1150,7 @@
                           </pic:cNvPicPr>
                         </pic:nvPicPr>
                         <pic:blipFill>
-                          <a:blip r:embed="rId11"/>
+                          <a:blip r:embed="rId15"/>
                           <a:stretch>
                             <a:fillRect/>
                           </a:stretch>
@@ -965,7 +1264,7 @@
                           </pic:cNvPicPr>
                         </pic:nvPicPr>
                         <pic:blipFill>
-                          <a:blip r:embed="rId12"/>
+                          <a:blip r:embed="rId16"/>
                           <a:stretch>
                             <a:fillRect/>
                           </a:stretch>
@@ -994,8 +1293,6 @@
             <w:pPr>
               <w:jc w:val="center"/>
             </w:pPr>
-            <w:bookmarkStart w:id="0" w:name="_GoBack"/>
-            <w:bookmarkEnd w:id="0"/>
             <w:r>
               <w:br w:type="textWrapping"/>
             </w:r>
@@ -1018,7 +1315,7 @@
                           </pic:cNvPicPr>
                         </pic:nvPicPr>
                         <pic:blipFill>
-                          <a:blip r:embed="rId13"/>
+                          <a:blip r:embed="rId17"/>
                           <a:stretch>
                             <a:fillRect/>
                           </a:stretch>
@@ -1069,7 +1366,7 @@
                           </pic:cNvPicPr>
                         </pic:nvPicPr>
                         <pic:blipFill>
-                          <a:blip r:embed="rId14"/>
+                          <a:blip r:embed="rId18"/>
                           <a:stretch>
                             <a:fillRect/>
                           </a:stretch>
@@ -1097,626 +1394,997 @@
         </w:tc>
       </w:tr>
     </w:tbl>
-    <w:p/>
     <w:p>
+      <w:pPr>
+        <w:pStyle w:val="2"/>
+        <w:numPr>
+          <w:numId w:val="0"/>
+        </w:numPr>
+        <w:rPr>
+          <w:sz w:val="32"/>
+          <w:szCs w:val="32"/>
+        </w:rPr>
+      </w:pPr>
       <w:r>
         <w:rPr>
           <w:b/>
           <w:color w:val="0D47A1"/>
-          <w:sz w:val="28"/>
+          <w:sz w:val="32"/>
+          <w:szCs w:val="32"/>
         </w:rPr>
-        <w:t>4. Research và báo cáo thực nghiệm</w:t>
-      </w:r>
-    </w:p>
-    <w:p>
-      <w:r>
-        <w:t>Thiết kế thí nghiệm:</w:t>
-      </w:r>
-      <w:r>
         <w:br w:type="textWrapping"/>
       </w:r>
       <w:r>
-        <w:t>• Quy mô: 200 pharmacists</w:t>
+        <w:rPr>
+          <w:rFonts w:hint="default"/>
+          <w:b/>
+          <w:color w:val="0D47A1"/>
+          <w:sz w:val="32"/>
+          <w:szCs w:val="32"/>
+          <w:lang w:val="en-US"/>
+        </w:rPr>
+        <w:t xml:space="preserve">4. </w:t>
       </w:r>
-      <w:r>
-        <w:br w:type="textWrapping"/>
-      </w:r>
-      <w:r>
-        <w:t>• Số cơ chế so sánh: 4 mechanisms</w:t>
-      </w:r>
-      <w:r>
-        <w:br w:type="textWrapping"/>
-      </w:r>
-      <w:r>
-        <w:t>• Số lần chạy mỗi cơ chế: 3 lần</w:t>
-      </w:r>
-      <w:r>
-        <w:br w:type="textWrapping"/>
-      </w:r>
-      <w:r>
-        <w:t>• Chỉ số tổng hợp: lấy giá trị trung bình (average) theo từng cơ chế</w:t>
-      </w:r>
-      <w:r>
-        <w:br w:type="textWrapping"/>
-      </w:r>
-    </w:p>
-    <w:p>
-      <w:r>
-        <w:rPr>
-          <w:b/>
-        </w:rPr>
-        <w:t xml:space="preserve">Research Question: </w:t>
-      </w:r>
-      <w:r>
-        <w:t>Cơ chế nào đạt 0% tất cả lỗi và đồng thời có avg response time &lt; 100 ms?</w:t>
-      </w:r>
-    </w:p>
-    <w:p/>
-    <w:p>
+      <w:bookmarkStart w:id="0" w:name="_GoBack"/>
+      <w:bookmarkEnd w:id="0"/>
       <w:r>
         <w:rPr>
           <w:b/>
           <w:color w:val="0D47A1"/>
-          <w:sz w:val="28"/>
+          <w:sz w:val="32"/>
+          <w:szCs w:val="32"/>
         </w:rPr>
-        <w:t>4.1. Bảng số liệu thực nghiệm (điền sau khi chạy full experiment)</w:t>
-      </w:r>
-    </w:p>
-    <w:tbl>
-      <w:tblPr>
-        <w:tblStyle w:val="12"/>
-        <w:tblW w:w="0" w:type="auto"/>
-        <w:tblInd w:w="0" w:type="dxa"/>
-        <w:tblLayout w:type="autofit"/>
-        <w:tblCellMar>
-          <w:top w:w="0" w:type="dxa"/>
-          <w:left w:w="108" w:type="dxa"/>
-          <w:bottom w:w="0" w:type="dxa"/>
-          <w:right w:w="108" w:type="dxa"/>
-        </w:tblCellMar>
-      </w:tblPr>
-      <w:tblGrid>
-        <w:gridCol w:w="2160"/>
-        <w:gridCol w:w="2160"/>
-        <w:gridCol w:w="2160"/>
-        <w:gridCol w:w="2160"/>
-      </w:tblGrid>
-      <w:tr>
-        <w:tblPrEx>
-          <w:tblCellMar>
-            <w:top w:w="0" w:type="dxa"/>
-            <w:left w:w="108" w:type="dxa"/>
-            <w:bottom w:w="0" w:type="dxa"/>
-            <w:right w:w="108" w:type="dxa"/>
-          </w:tblCellMar>
-        </w:tblPrEx>
-        <w:tc>
-          <w:tcPr>
-            <w:tcW w:w="2160" w:type="dxa"/>
-            <w:tcBorders>
-              <w:top w:val="single" w:color="566573" w:sz="8" w:space="0"/>
-              <w:left w:val="single" w:color="566573" w:sz="8" w:space="0"/>
-              <w:bottom w:val="single" w:color="566573" w:sz="8" w:space="0"/>
-              <w:right w:val="single" w:color="566573" w:sz="8" w:space="0"/>
-            </w:tcBorders>
-          </w:tcPr>
-          <w:p>
-            <w:r>
-              <w:t>Mechanism</w:t>
-            </w:r>
-          </w:p>
-        </w:tc>
-        <w:tc>
-          <w:tcPr>
-            <w:tcW w:w="2160" w:type="dxa"/>
-            <w:tcBorders>
-              <w:top w:val="single" w:color="566573" w:sz="8" w:space="0"/>
-              <w:left w:val="single" w:color="566573" w:sz="8" w:space="0"/>
-              <w:bottom w:val="single" w:color="566573" w:sz="8" w:space="0"/>
-              <w:right w:val="single" w:color="566573" w:sz="8" w:space="0"/>
-            </w:tcBorders>
-          </w:tcPr>
-          <w:p>
-            <w:r>
-              <w:t>Run 1/2/3 Response Time (ms)</w:t>
-            </w:r>
-          </w:p>
-        </w:tc>
-        <w:tc>
-          <w:tcPr>
-            <w:tcW w:w="2160" w:type="dxa"/>
-            <w:tcBorders>
-              <w:top w:val="single" w:color="566573" w:sz="8" w:space="0"/>
-              <w:left w:val="single" w:color="566573" w:sz="8" w:space="0"/>
-              <w:bottom w:val="single" w:color="566573" w:sz="8" w:space="0"/>
-              <w:right w:val="single" w:color="566573" w:sz="8" w:space="0"/>
-            </w:tcBorders>
-          </w:tcPr>
-          <w:p>
-            <w:r>
-              <w:t>Average Response Time (ms)</w:t>
-            </w:r>
-          </w:p>
-        </w:tc>
-        <w:tc>
-          <w:tcPr>
-            <w:tcW w:w="2160" w:type="dxa"/>
-            <w:tcBorders>
-              <w:top w:val="single" w:color="566573" w:sz="8" w:space="0"/>
-              <w:left w:val="single" w:color="566573" w:sz="8" w:space="0"/>
-              <w:bottom w:val="single" w:color="566573" w:sz="8" w:space="0"/>
-              <w:right w:val="single" w:color="566573" w:sz="8" w:space="0"/>
-            </w:tcBorders>
-          </w:tcPr>
-          <w:p>
-            <w:r>
-              <w:t>Error Rate (%)</w:t>
-            </w:r>
-          </w:p>
-        </w:tc>
-      </w:tr>
-      <w:tr>
-        <w:tblPrEx>
-          <w:tblCellMar>
-            <w:top w:w="0" w:type="dxa"/>
-            <w:left w:w="108" w:type="dxa"/>
-            <w:bottom w:w="0" w:type="dxa"/>
-            <w:right w:w="108" w:type="dxa"/>
-          </w:tblCellMar>
-        </w:tblPrEx>
-        <w:tc>
-          <w:tcPr>
-            <w:tcW w:w="2160" w:type="dxa"/>
-            <w:tcBorders>
-              <w:top w:val="single" w:color="566573" w:sz="8" w:space="0"/>
-              <w:left w:val="single" w:color="566573" w:sz="8" w:space="0"/>
-              <w:bottom w:val="single" w:color="566573" w:sz="8" w:space="0"/>
-              <w:right w:val="single" w:color="566573" w:sz="8" w:space="0"/>
-            </w:tcBorders>
-          </w:tcPr>
-          <w:p>
-            <w:r>
-              <w:t>Mechanism A</w:t>
-            </w:r>
-          </w:p>
-        </w:tc>
-        <w:tc>
-          <w:tcPr>
-            <w:tcW w:w="2160" w:type="dxa"/>
-            <w:tcBorders>
-              <w:top w:val="single" w:color="566573" w:sz="8" w:space="0"/>
-              <w:left w:val="single" w:color="566573" w:sz="8" w:space="0"/>
-              <w:bottom w:val="single" w:color="566573" w:sz="8" w:space="0"/>
-              <w:right w:val="single" w:color="566573" w:sz="8" w:space="0"/>
-            </w:tcBorders>
-          </w:tcPr>
-          <w:p>
-            <w:r>
-              <w:t>... / ... / ...</w:t>
-            </w:r>
-          </w:p>
-        </w:tc>
-        <w:tc>
-          <w:tcPr>
-            <w:tcW w:w="2160" w:type="dxa"/>
-            <w:tcBorders>
-              <w:top w:val="single" w:color="566573" w:sz="8" w:space="0"/>
-              <w:left w:val="single" w:color="566573" w:sz="8" w:space="0"/>
-              <w:bottom w:val="single" w:color="566573" w:sz="8" w:space="0"/>
-              <w:right w:val="single" w:color="566573" w:sz="8" w:space="0"/>
-            </w:tcBorders>
-          </w:tcPr>
-          <w:p>
-            <w:r>
-              <w:t>...</w:t>
-            </w:r>
-          </w:p>
-        </w:tc>
-        <w:tc>
-          <w:tcPr>
-            <w:tcW w:w="2160" w:type="dxa"/>
-            <w:tcBorders>
-              <w:top w:val="single" w:color="566573" w:sz="8" w:space="0"/>
-              <w:left w:val="single" w:color="566573" w:sz="8" w:space="0"/>
-              <w:bottom w:val="single" w:color="566573" w:sz="8" w:space="0"/>
-              <w:right w:val="single" w:color="566573" w:sz="8" w:space="0"/>
-            </w:tcBorders>
-          </w:tcPr>
-          <w:p>
-            <w:r>
-              <w:t>...</w:t>
-            </w:r>
-          </w:p>
-        </w:tc>
-      </w:tr>
-      <w:tr>
-        <w:tblPrEx>
-          <w:tblCellMar>
-            <w:top w:w="0" w:type="dxa"/>
-            <w:left w:w="108" w:type="dxa"/>
-            <w:bottom w:w="0" w:type="dxa"/>
-            <w:right w:w="108" w:type="dxa"/>
-          </w:tblCellMar>
-        </w:tblPrEx>
-        <w:tc>
-          <w:tcPr>
-            <w:tcW w:w="2160" w:type="dxa"/>
-            <w:tcBorders>
-              <w:top w:val="single" w:color="566573" w:sz="8" w:space="0"/>
-              <w:left w:val="single" w:color="566573" w:sz="8" w:space="0"/>
-              <w:bottom w:val="single" w:color="566573" w:sz="8" w:space="0"/>
-              <w:right w:val="single" w:color="566573" w:sz="8" w:space="0"/>
-            </w:tcBorders>
-          </w:tcPr>
-          <w:p>
-            <w:r>
-              <w:t>Mechanism B</w:t>
-            </w:r>
-          </w:p>
-        </w:tc>
-        <w:tc>
-          <w:tcPr>
-            <w:tcW w:w="2160" w:type="dxa"/>
-            <w:tcBorders>
-              <w:top w:val="single" w:color="566573" w:sz="8" w:space="0"/>
-              <w:left w:val="single" w:color="566573" w:sz="8" w:space="0"/>
-              <w:bottom w:val="single" w:color="566573" w:sz="8" w:space="0"/>
-              <w:right w:val="single" w:color="566573" w:sz="8" w:space="0"/>
-            </w:tcBorders>
-          </w:tcPr>
-          <w:p>
-            <w:r>
-              <w:t>... / ... / ...</w:t>
-            </w:r>
-          </w:p>
-        </w:tc>
-        <w:tc>
-          <w:tcPr>
-            <w:tcW w:w="2160" w:type="dxa"/>
-            <w:tcBorders>
-              <w:top w:val="single" w:color="566573" w:sz="8" w:space="0"/>
-              <w:left w:val="single" w:color="566573" w:sz="8" w:space="0"/>
-              <w:bottom w:val="single" w:color="566573" w:sz="8" w:space="0"/>
-              <w:right w:val="single" w:color="566573" w:sz="8" w:space="0"/>
-            </w:tcBorders>
-          </w:tcPr>
-          <w:p>
-            <w:r>
-              <w:t>...</w:t>
-            </w:r>
-          </w:p>
-        </w:tc>
-        <w:tc>
-          <w:tcPr>
-            <w:tcW w:w="2160" w:type="dxa"/>
-            <w:tcBorders>
-              <w:top w:val="single" w:color="566573" w:sz="8" w:space="0"/>
-              <w:left w:val="single" w:color="566573" w:sz="8" w:space="0"/>
-              <w:bottom w:val="single" w:color="566573" w:sz="8" w:space="0"/>
-              <w:right w:val="single" w:color="566573" w:sz="8" w:space="0"/>
-            </w:tcBorders>
-          </w:tcPr>
-          <w:p>
-            <w:r>
-              <w:t>...</w:t>
-            </w:r>
-          </w:p>
-        </w:tc>
-      </w:tr>
-      <w:tr>
-        <w:tblPrEx>
-          <w:tblCellMar>
-            <w:top w:w="0" w:type="dxa"/>
-            <w:left w:w="108" w:type="dxa"/>
-            <w:bottom w:w="0" w:type="dxa"/>
-            <w:right w:w="108" w:type="dxa"/>
-          </w:tblCellMar>
-        </w:tblPrEx>
-        <w:tc>
-          <w:tcPr>
-            <w:tcW w:w="2160" w:type="dxa"/>
-            <w:tcBorders>
-              <w:top w:val="single" w:color="566573" w:sz="8" w:space="0"/>
-              <w:left w:val="single" w:color="566573" w:sz="8" w:space="0"/>
-              <w:bottom w:val="single" w:color="566573" w:sz="8" w:space="0"/>
-              <w:right w:val="single" w:color="566573" w:sz="8" w:space="0"/>
-            </w:tcBorders>
-          </w:tcPr>
-          <w:p>
-            <w:r>
-              <w:t>Mechanism C</w:t>
-            </w:r>
-          </w:p>
-        </w:tc>
-        <w:tc>
-          <w:tcPr>
-            <w:tcW w:w="2160" w:type="dxa"/>
-            <w:tcBorders>
-              <w:top w:val="single" w:color="566573" w:sz="8" w:space="0"/>
-              <w:left w:val="single" w:color="566573" w:sz="8" w:space="0"/>
-              <w:bottom w:val="single" w:color="566573" w:sz="8" w:space="0"/>
-              <w:right w:val="single" w:color="566573" w:sz="8" w:space="0"/>
-            </w:tcBorders>
-          </w:tcPr>
-          <w:p>
-            <w:r>
-              <w:t>... / ... / ...</w:t>
-            </w:r>
-          </w:p>
-        </w:tc>
-        <w:tc>
-          <w:tcPr>
-            <w:tcW w:w="2160" w:type="dxa"/>
-            <w:tcBorders>
-              <w:top w:val="single" w:color="566573" w:sz="8" w:space="0"/>
-              <w:left w:val="single" w:color="566573" w:sz="8" w:space="0"/>
-              <w:bottom w:val="single" w:color="566573" w:sz="8" w:space="0"/>
-              <w:right w:val="single" w:color="566573" w:sz="8" w:space="0"/>
-            </w:tcBorders>
-          </w:tcPr>
-          <w:p>
-            <w:r>
-              <w:t>...</w:t>
-            </w:r>
-          </w:p>
-        </w:tc>
-        <w:tc>
-          <w:tcPr>
-            <w:tcW w:w="2160" w:type="dxa"/>
-            <w:tcBorders>
-              <w:top w:val="single" w:color="566573" w:sz="8" w:space="0"/>
-              <w:left w:val="single" w:color="566573" w:sz="8" w:space="0"/>
-              <w:bottom w:val="single" w:color="566573" w:sz="8" w:space="0"/>
-              <w:right w:val="single" w:color="566573" w:sz="8" w:space="0"/>
-            </w:tcBorders>
-          </w:tcPr>
-          <w:p>
-            <w:r>
-              <w:t>...</w:t>
-            </w:r>
-          </w:p>
-        </w:tc>
-      </w:tr>
-      <w:tr>
-        <w:tblPrEx>
-          <w:tblCellMar>
-            <w:top w:w="0" w:type="dxa"/>
-            <w:left w:w="108" w:type="dxa"/>
-            <w:bottom w:w="0" w:type="dxa"/>
-            <w:right w:w="108" w:type="dxa"/>
-          </w:tblCellMar>
-        </w:tblPrEx>
-        <w:tc>
-          <w:tcPr>
-            <w:tcW w:w="2160" w:type="dxa"/>
-            <w:tcBorders>
-              <w:top w:val="single" w:color="566573" w:sz="8" w:space="0"/>
-              <w:left w:val="single" w:color="566573" w:sz="8" w:space="0"/>
-              <w:bottom w:val="single" w:color="566573" w:sz="8" w:space="0"/>
-              <w:right w:val="single" w:color="566573" w:sz="8" w:space="0"/>
-            </w:tcBorders>
-          </w:tcPr>
-          <w:p>
-            <w:r>
-              <w:t>Mechanism D</w:t>
-            </w:r>
-          </w:p>
-        </w:tc>
-        <w:tc>
-          <w:tcPr>
-            <w:tcW w:w="2160" w:type="dxa"/>
-            <w:tcBorders>
-              <w:top w:val="single" w:color="566573" w:sz="8" w:space="0"/>
-              <w:left w:val="single" w:color="566573" w:sz="8" w:space="0"/>
-              <w:bottom w:val="single" w:color="566573" w:sz="8" w:space="0"/>
-              <w:right w:val="single" w:color="566573" w:sz="8" w:space="0"/>
-            </w:tcBorders>
-          </w:tcPr>
-          <w:p>
-            <w:r>
-              <w:t>... / ... / ...</w:t>
-            </w:r>
-          </w:p>
-        </w:tc>
-        <w:tc>
-          <w:tcPr>
-            <w:tcW w:w="2160" w:type="dxa"/>
-            <w:tcBorders>
-              <w:top w:val="single" w:color="566573" w:sz="8" w:space="0"/>
-              <w:left w:val="single" w:color="566573" w:sz="8" w:space="0"/>
-              <w:bottom w:val="single" w:color="566573" w:sz="8" w:space="0"/>
-              <w:right w:val="single" w:color="566573" w:sz="8" w:space="0"/>
-            </w:tcBorders>
-          </w:tcPr>
-          <w:p>
-            <w:r>
-              <w:t>...</w:t>
-            </w:r>
-          </w:p>
-        </w:tc>
-        <w:tc>
-          <w:tcPr>
-            <w:tcW w:w="2160" w:type="dxa"/>
-            <w:tcBorders>
-              <w:top w:val="single" w:color="566573" w:sz="8" w:space="0"/>
-              <w:left w:val="single" w:color="566573" w:sz="8" w:space="0"/>
-              <w:bottom w:val="single" w:color="566573" w:sz="8" w:space="0"/>
-              <w:right w:val="single" w:color="566573" w:sz="8" w:space="0"/>
-            </w:tcBorders>
-          </w:tcPr>
-          <w:p>
-            <w:r>
-              <w:t>...</w:t>
-            </w:r>
-          </w:p>
-        </w:tc>
-      </w:tr>
-    </w:tbl>
-    <w:p/>
-    <w:p>
-      <w:r>
-        <w:rPr>
-          <w:b/>
-          <w:color w:val="0D47A1"/>
-          <w:sz w:val="28"/>
-        </w:rPr>
-        <w:t>4.2. Biểu đồ so sánh (response time vs error rate)</w:t>
+        <w:t>Research và báo cáo thực nghiệm</w:t>
       </w:r>
     </w:p>
     <w:p>
+      <w:pPr>
+        <w:pStyle w:val="3"/>
+        <w:spacing w:before="299" w:beforeAutospacing="0" w:after="299" w:afterAutospacing="0"/>
+        <w:rPr>
+          <w:sz w:val="28"/>
+          <w:szCs w:val="28"/>
+        </w:rPr>
+      </w:pPr>
       <w:r>
         <w:rPr>
+          <w:rFonts w:hint="default" w:ascii="Calibri" w:hAnsi="Calibri" w:eastAsia="Calibri" w:cs="Calibri"/>
           <w:b/>
-          <w:color w:val="0D47A1"/>
+          <w:bCs/>
           <w:sz w:val="28"/>
+          <w:szCs w:val="28"/>
+          <w:lang w:val="en-US"/>
         </w:rPr>
-        <w:t>Biểu đồ 4 cơ chế</w:t>
+        <w:t>4</w:t>
       </w:r>
-    </w:p>
-    <w:tbl>
-      <w:tblPr>
-        <w:tblStyle w:val="12"/>
-        <w:tblW w:w="0" w:type="auto"/>
-        <w:tblInd w:w="0" w:type="dxa"/>
-        <w:tblLayout w:type="fixed"/>
-        <w:tblCellMar>
-          <w:top w:w="0" w:type="dxa"/>
-          <w:left w:w="108" w:type="dxa"/>
-          <w:bottom w:w="0" w:type="dxa"/>
-          <w:right w:w="108" w:type="dxa"/>
-        </w:tblCellMar>
-      </w:tblPr>
-      <w:tblGrid>
-        <w:gridCol w:w="8640"/>
-      </w:tblGrid>
-      <w:tr>
-        <w:tblPrEx>
-          <w:tblCellMar>
-            <w:top w:w="0" w:type="dxa"/>
-            <w:left w:w="108" w:type="dxa"/>
-            <w:bottom w:w="0" w:type="dxa"/>
-            <w:right w:w="108" w:type="dxa"/>
-          </w:tblCellMar>
-        </w:tblPrEx>
-        <w:tc>
-          <w:tcPr>
-            <w:tcW w:w="8640" w:type="dxa"/>
-            <w:tcBorders>
-              <w:top w:val="single" w:color="1F618D" w:sz="12" w:space="0"/>
-              <w:left w:val="single" w:color="1F618D" w:sz="12" w:space="0"/>
-              <w:bottom w:val="single" w:color="1F618D" w:sz="12" w:space="0"/>
-              <w:right w:val="single" w:color="1F618D" w:sz="12" w:space="0"/>
-            </w:tcBorders>
-          </w:tcPr>
-          <w:p>
-            <w:pPr>
-              <w:jc w:val="left"/>
-            </w:pPr>
-            <w:r>
-              <w:rPr>
-                <w:b/>
-              </w:rPr>
-              <w:t>Vùng ảnh: Biểu đồ 4 cơ chế</w:t>
-            </w:r>
-          </w:p>
-        </w:tc>
-      </w:tr>
-      <w:tr>
-        <w:tblPrEx>
-          <w:tblCellMar>
-            <w:top w:w="0" w:type="dxa"/>
-            <w:left w:w="108" w:type="dxa"/>
-            <w:bottom w:w="0" w:type="dxa"/>
-            <w:right w:w="108" w:type="dxa"/>
-          </w:tblCellMar>
-        </w:tblPrEx>
-        <w:tc>
-          <w:tcPr>
-            <w:tcW w:w="8640" w:type="dxa"/>
-            <w:tcBorders>
-              <w:top w:val="single" w:color="1F618D" w:sz="12" w:space="0"/>
-              <w:left w:val="single" w:color="1F618D" w:sz="12" w:space="0"/>
-              <w:bottom w:val="single" w:color="1F618D" w:sz="12" w:space="0"/>
-              <w:right w:val="single" w:color="1F618D" w:sz="12" w:space="0"/>
-            </w:tcBorders>
-          </w:tcPr>
-          <w:p>
-            <w:pPr>
-              <w:jc w:val="center"/>
-            </w:pPr>
-            <w:r>
-              <w:rPr>
-                <w:b/>
-                <w:color w:val="616161"/>
-                <w:sz w:val="24"/>
-              </w:rPr>
-              <w:t>[DÁN SCREENSHOT TẠI ĐÂY]</w:t>
-            </w:r>
-            <w:r>
-              <w:rPr>
-                <w:b/>
-                <w:color w:val="616161"/>
-                <w:sz w:val="24"/>
-              </w:rPr>
-              <w:br w:type="textWrapping"/>
-            </w:r>
-            <w:r>
-              <w:rPr>
-                <w:i/>
-                <w:sz w:val="20"/>
-              </w:rPr>
-              <w:t>Gợi ý: dùng biểu đồ kết hợp (Column cho Avg Response Time và Line cho Error Rate), gồm 4 cơ chế A/B/C/D.</w:t>
-            </w:r>
-          </w:p>
-        </w:tc>
-      </w:tr>
-    </w:tbl>
-    <w:p/>
-    <w:p>
       <w:r>
         <w:rPr>
+          <w:rFonts w:ascii="Calibri" w:hAnsi="Calibri" w:eastAsia="Calibri" w:cs="Calibri"/>
           <w:b/>
-          <w:color w:val="0D47A1"/>
+          <w:bCs/>
           <w:sz w:val="28"/>
+          <w:szCs w:val="28"/>
+          <w:lang w:val="en-US"/>
         </w:rPr>
-        <w:t>4.3. Kết luận Research Question</w:t>
+        <w:t>.1. Mục tiêu</w:t>
       </w:r>
     </w:p>
     <w:p>
+      <w:pPr>
+        <w:pStyle w:val="143"/>
+        <w:numPr>
+          <w:ilvl w:val="0"/>
+          <w:numId w:val="7"/>
+        </w:numPr>
+        <w:spacing w:before="240" w:beforeAutospacing="0" w:after="240" w:afterAutospacing="0"/>
+        <w:rPr>
+          <w:rFonts w:ascii="Calibri" w:hAnsi="Calibri" w:eastAsia="Calibri" w:cs="Calibri"/>
+          <w:sz w:val="22"/>
+          <w:szCs w:val="22"/>
+          <w:lang w:val="en-US"/>
+        </w:rPr>
+      </w:pPr>
       <w:r>
-        <w:t>Mẫu kết luận:</w:t>
+        <w:rPr>
+          <w:rFonts w:ascii="Calibri" w:hAnsi="Calibri" w:eastAsia="Calibri" w:cs="Calibri"/>
+          <w:sz w:val="22"/>
+          <w:szCs w:val="22"/>
+          <w:lang w:val="en-US"/>
+        </w:rPr>
+        <w:t>Đánh giá hiệu suất và độ chính xác của 4 cơ chế đồng bộ:</w:t>
+      </w:r>
+    </w:p>
+    <w:p>
+      <w:pPr>
+        <w:pStyle w:val="143"/>
+        <w:numPr>
+          <w:ilvl w:val="1"/>
+          <w:numId w:val="7"/>
+        </w:numPr>
+        <w:spacing w:before="240" w:beforeAutospacing="0" w:after="240" w:afterAutospacing="0"/>
+        <w:rPr>
+          <w:rFonts w:ascii="Calibri" w:hAnsi="Calibri" w:eastAsia="Calibri" w:cs="Calibri"/>
+          <w:sz w:val="22"/>
+          <w:szCs w:val="22"/>
+          <w:lang w:val="en-US"/>
+        </w:rPr>
+      </w:pPr>
+      <w:r>
+        <w:rPr>
+          <w:rFonts w:ascii="Calibri" w:hAnsi="Calibri" w:eastAsia="Calibri" w:cs="Calibri"/>
+          <w:sz w:val="22"/>
+          <w:szCs w:val="22"/>
+          <w:lang w:val="en-US"/>
+        </w:rPr>
+        <w:t>NO_LOCK</w:t>
+      </w:r>
+    </w:p>
+    <w:p>
+      <w:pPr>
+        <w:pStyle w:val="143"/>
+        <w:numPr>
+          <w:ilvl w:val="1"/>
+          <w:numId w:val="7"/>
+        </w:numPr>
+        <w:spacing w:before="240" w:beforeAutospacing="0" w:after="240" w:afterAutospacing="0"/>
+        <w:rPr>
+          <w:rFonts w:ascii="Calibri" w:hAnsi="Calibri" w:eastAsia="Calibri" w:cs="Calibri"/>
+          <w:sz w:val="22"/>
+          <w:szCs w:val="22"/>
+          <w:lang w:val="en-US"/>
+        </w:rPr>
+      </w:pPr>
+      <w:r>
+        <w:rPr>
+          <w:rFonts w:ascii="Calibri" w:hAnsi="Calibri" w:eastAsia="Calibri" w:cs="Calibri"/>
+          <w:sz w:val="22"/>
+          <w:szCs w:val="22"/>
+          <w:lang w:val="en-US"/>
+        </w:rPr>
+        <w:t>SYNC</w:t>
+      </w:r>
+    </w:p>
+    <w:p>
+      <w:pPr>
+        <w:pStyle w:val="143"/>
+        <w:numPr>
+          <w:ilvl w:val="1"/>
+          <w:numId w:val="7"/>
+        </w:numPr>
+        <w:spacing w:before="240" w:beforeAutospacing="0" w:after="240" w:afterAutospacing="0"/>
+        <w:rPr>
+          <w:rFonts w:ascii="Calibri" w:hAnsi="Calibri" w:eastAsia="Calibri" w:cs="Calibri"/>
+          <w:sz w:val="22"/>
+          <w:szCs w:val="22"/>
+          <w:lang w:val="en-US"/>
+        </w:rPr>
+      </w:pPr>
+      <w:r>
+        <w:rPr>
+          <w:rFonts w:ascii="Calibri" w:hAnsi="Calibri" w:eastAsia="Calibri" w:cs="Calibri"/>
+          <w:sz w:val="22"/>
+          <w:szCs w:val="22"/>
+          <w:lang w:val="en-US"/>
+        </w:rPr>
+        <w:t>OPTIMISTIC</w:t>
+      </w:r>
+    </w:p>
+    <w:p>
+      <w:pPr>
+        <w:pStyle w:val="143"/>
+        <w:numPr>
+          <w:ilvl w:val="1"/>
+          <w:numId w:val="7"/>
+        </w:numPr>
+        <w:spacing w:before="240" w:beforeAutospacing="0" w:after="240" w:afterAutospacing="0"/>
+        <w:rPr>
+          <w:rFonts w:ascii="Calibri" w:hAnsi="Calibri" w:eastAsia="Calibri" w:cs="Calibri"/>
+          <w:sz w:val="22"/>
+          <w:szCs w:val="22"/>
+          <w:lang w:val="en-US"/>
+        </w:rPr>
+      </w:pPr>
+      <w:r>
+        <w:rPr>
+          <w:rFonts w:ascii="Calibri" w:hAnsi="Calibri" w:eastAsia="Calibri" w:cs="Calibri"/>
+          <w:sz w:val="22"/>
+          <w:szCs w:val="22"/>
+          <w:lang w:val="en-US"/>
+        </w:rPr>
+        <w:t>FILE_LOCK</w:t>
+      </w:r>
+    </w:p>
+    <w:p>
+      <w:pPr>
+        <w:pStyle w:val="143"/>
+        <w:numPr>
+          <w:ilvl w:val="0"/>
+          <w:numId w:val="7"/>
+        </w:numPr>
+        <w:spacing w:before="240" w:beforeAutospacing="0" w:after="240" w:afterAutospacing="0"/>
+        <w:rPr>
+          <w:rFonts w:ascii="Calibri" w:hAnsi="Calibri" w:eastAsia="Calibri" w:cs="Calibri"/>
+          <w:sz w:val="22"/>
+          <w:szCs w:val="22"/>
+          <w:lang w:val="en-US"/>
+        </w:rPr>
+      </w:pPr>
+      <w:r>
+        <w:rPr>
+          <w:rFonts w:ascii="Calibri" w:hAnsi="Calibri" w:eastAsia="Calibri" w:cs="Calibri"/>
+          <w:sz w:val="22"/>
+          <w:szCs w:val="22"/>
+          <w:lang w:val="en-US"/>
+        </w:rPr>
+        <w:t>Chứng minh sự khác biệt giữa hệ thống không đồng bộ và có đồng bộ.</w:t>
+      </w:r>
+    </w:p>
+    <w:p>
+      <w:pPr>
+        <w:pStyle w:val="143"/>
+        <w:numPr>
+          <w:ilvl w:val="0"/>
+          <w:numId w:val="7"/>
+        </w:numPr>
+        <w:spacing w:before="240" w:beforeAutospacing="0" w:after="240" w:afterAutospacing="0"/>
+        <w:rPr>
+          <w:rFonts w:ascii="Calibri" w:hAnsi="Calibri" w:eastAsia="Calibri" w:cs="Calibri"/>
+          <w:sz w:val="22"/>
+          <w:szCs w:val="22"/>
+          <w:lang w:val="en-US"/>
+        </w:rPr>
+      </w:pPr>
+      <w:r>
+        <w:rPr>
+          <w:rFonts w:ascii="Calibri" w:hAnsi="Calibri" w:eastAsia="Calibri" w:cs="Calibri"/>
+          <w:sz w:val="22"/>
+          <w:szCs w:val="22"/>
+          <w:lang w:val="en-US"/>
+        </w:rPr>
+        <w:t>Đưa ra cơ chế phù hợp nhất cho hệ thống quản lý chuỗi nhà thuốc.</w:t>
+      </w:r>
+    </w:p>
+    <w:p>
+      <w:pPr>
+        <w:pStyle w:val="3"/>
+        <w:spacing w:before="299" w:beforeAutospacing="0" w:after="299" w:afterAutospacing="0"/>
+        <w:rPr>
+          <w:sz w:val="28"/>
+          <w:szCs w:val="28"/>
+        </w:rPr>
+      </w:pPr>
+      <w:r>
+        <w:rPr>
+          <w:rFonts w:hint="default" w:ascii="Calibri" w:hAnsi="Calibri" w:eastAsia="Calibri" w:cs="Calibri"/>
+          <w:b/>
+          <w:bCs/>
+          <w:sz w:val="28"/>
+          <w:szCs w:val="28"/>
+          <w:lang w:val="en-US"/>
+        </w:rPr>
+        <w:t>4</w:t>
       </w:r>
       <w:r>
-        <w:br w:type="textWrapping"/>
+        <w:rPr>
+          <w:rFonts w:ascii="Calibri" w:hAnsi="Calibri" w:eastAsia="Calibri" w:cs="Calibri"/>
+          <w:b/>
+          <w:bCs/>
+          <w:sz w:val="28"/>
+          <w:szCs w:val="28"/>
+          <w:lang w:val="en-US"/>
+        </w:rPr>
+        <w:t>.2. Phương pháp</w:t>
+      </w:r>
+    </w:p>
+    <w:p>
+      <w:pPr>
+        <w:pStyle w:val="143"/>
+        <w:numPr>
+          <w:ilvl w:val="0"/>
+          <w:numId w:val="8"/>
+        </w:numPr>
+        <w:spacing w:before="240" w:beforeAutospacing="0" w:after="240" w:afterAutospacing="0"/>
+        <w:rPr>
+          <w:rFonts w:ascii="Calibri" w:hAnsi="Calibri" w:eastAsia="Calibri" w:cs="Calibri"/>
+          <w:sz w:val="22"/>
+          <w:szCs w:val="22"/>
+          <w:lang w:val="en-US"/>
+        </w:rPr>
+      </w:pPr>
+      <w:r>
+        <w:rPr>
+          <w:rFonts w:ascii="Calibri" w:hAnsi="Calibri" w:eastAsia="Calibri" w:cs="Calibri"/>
+          <w:sz w:val="22"/>
+          <w:szCs w:val="22"/>
+          <w:lang w:val="en-US"/>
+        </w:rPr>
+        <w:t xml:space="preserve">Chạy mô phỏng với </w:t>
       </w:r>
       <w:r>
-        <w:t>• Cơ chế được chọn: [Tên cơ chế]</w:t>
+        <w:rPr>
+          <w:rFonts w:ascii="Calibri" w:hAnsi="Calibri" w:eastAsia="Calibri" w:cs="Calibri"/>
+          <w:b/>
+          <w:bCs/>
+          <w:sz w:val="22"/>
+          <w:szCs w:val="22"/>
+          <w:lang w:val="en-US"/>
+        </w:rPr>
+        <w:t>200 thread</w:t>
       </w:r>
       <w:r>
-        <w:br w:type="textWrapping"/>
+        <w:rPr>
+          <w:rFonts w:ascii="Calibri" w:hAnsi="Calibri" w:eastAsia="Calibri" w:cs="Calibri"/>
+          <w:sz w:val="22"/>
+          <w:szCs w:val="22"/>
+          <w:lang w:val="en-US"/>
+        </w:rPr>
+        <w:t xml:space="preserve"> cho từng cơ chế.</w:t>
+      </w:r>
+    </w:p>
+    <w:p>
+      <w:pPr>
+        <w:pStyle w:val="143"/>
+        <w:numPr>
+          <w:ilvl w:val="0"/>
+          <w:numId w:val="8"/>
+        </w:numPr>
+        <w:spacing w:before="240" w:beforeAutospacing="0" w:after="240" w:afterAutospacing="0"/>
+        <w:rPr>
+          <w:rFonts w:ascii="Calibri" w:hAnsi="Calibri" w:eastAsia="Calibri" w:cs="Calibri"/>
+          <w:sz w:val="22"/>
+          <w:szCs w:val="22"/>
+          <w:lang w:val="en-US"/>
+        </w:rPr>
+      </w:pPr>
+      <w:r>
+        <w:rPr>
+          <w:rFonts w:ascii="Calibri" w:hAnsi="Calibri" w:eastAsia="Calibri" w:cs="Calibri"/>
+          <w:sz w:val="22"/>
+          <w:szCs w:val="22"/>
+          <w:lang w:val="en-US"/>
+        </w:rPr>
+        <w:t xml:space="preserve">Đo </w:t>
       </w:r>
       <w:r>
-        <w:t>• Avg Response Time: [xx.xx ms]</w:t>
+        <w:rPr>
+          <w:rFonts w:ascii="Calibri" w:hAnsi="Calibri" w:eastAsia="Calibri" w:cs="Calibri"/>
+          <w:b/>
+          <w:bCs/>
+          <w:sz w:val="22"/>
+          <w:szCs w:val="22"/>
+          <w:lang w:val="en-US"/>
+        </w:rPr>
+        <w:t>thời gian thực thi</w:t>
       </w:r>
       <w:r>
-        <w:br w:type="textWrapping"/>
+        <w:rPr>
+          <w:rFonts w:ascii="Calibri" w:hAnsi="Calibri" w:eastAsia="Calibri" w:cs="Calibri"/>
+          <w:sz w:val="22"/>
+          <w:szCs w:val="22"/>
+          <w:lang w:val="en-US"/>
+        </w:rPr>
+        <w:t xml:space="preserve"> (ms).</w:t>
+      </w:r>
+    </w:p>
+    <w:p>
+      <w:pPr>
+        <w:pStyle w:val="143"/>
+        <w:numPr>
+          <w:ilvl w:val="0"/>
+          <w:numId w:val="8"/>
+        </w:numPr>
+        <w:spacing w:before="240" w:beforeAutospacing="0" w:after="240" w:afterAutospacing="0"/>
+        <w:rPr>
+          <w:rFonts w:ascii="Calibri" w:hAnsi="Calibri" w:eastAsia="Calibri" w:cs="Calibri"/>
+          <w:sz w:val="22"/>
+          <w:szCs w:val="22"/>
+          <w:lang w:val="en-US"/>
+        </w:rPr>
+      </w:pPr>
+      <w:r>
+        <w:rPr>
+          <w:rFonts w:ascii="Calibri" w:hAnsi="Calibri" w:eastAsia="Calibri" w:cs="Calibri"/>
+          <w:sz w:val="22"/>
+          <w:szCs w:val="22"/>
+          <w:lang w:val="en-US"/>
+        </w:rPr>
+        <w:t xml:space="preserve">Đếm số </w:t>
       </w:r>
       <w:r>
-        <w:t>• Error Rate: [0.00%]</w:t>
+        <w:rPr>
+          <w:rFonts w:ascii="Calibri" w:hAnsi="Calibri" w:eastAsia="Calibri" w:cs="Calibri"/>
+          <w:b/>
+          <w:bCs/>
+          <w:sz w:val="22"/>
+          <w:szCs w:val="22"/>
+          <w:lang w:val="en-US"/>
+        </w:rPr>
+        <w:t>đơn phát thành công</w:t>
       </w:r>
       <w:r>
-        <w:br w:type="textWrapping"/>
+        <w:rPr>
+          <w:rFonts w:ascii="Calibri" w:hAnsi="Calibri" w:eastAsia="Calibri" w:cs="Calibri"/>
+          <w:sz w:val="22"/>
+          <w:szCs w:val="22"/>
+          <w:lang w:val="en-US"/>
+        </w:rPr>
+        <w:t>.</w:t>
+      </w:r>
+    </w:p>
+    <w:p>
+      <w:pPr>
+        <w:pStyle w:val="143"/>
+        <w:numPr>
+          <w:ilvl w:val="0"/>
+          <w:numId w:val="8"/>
+        </w:numPr>
+        <w:spacing w:before="240" w:beforeAutospacing="0" w:after="240" w:afterAutospacing="0"/>
+        <w:rPr>
+          <w:rFonts w:ascii="Calibri" w:hAnsi="Calibri" w:eastAsia="Calibri" w:cs="Calibri"/>
+          <w:sz w:val="22"/>
+          <w:szCs w:val="22"/>
+          <w:lang w:val="en-US"/>
+        </w:rPr>
+      </w:pPr>
+      <w:r>
+        <w:rPr>
+          <w:rFonts w:ascii="Calibri" w:hAnsi="Calibri" w:eastAsia="Calibri" w:cs="Calibri"/>
+          <w:sz w:val="22"/>
+          <w:szCs w:val="22"/>
+          <w:lang w:val="en-US"/>
+        </w:rPr>
+        <w:t xml:space="preserve">Thực hiện </w:t>
       </w:r>
       <w:r>
-        <w:t>• So sánh với các cơ chế còn lại: [nêu ngắn gọn chênh lệch]</w:t>
+        <w:rPr>
+          <w:rFonts w:ascii="Calibri" w:hAnsi="Calibri" w:eastAsia="Calibri" w:cs="Calibri"/>
+          <w:b/>
+          <w:bCs/>
+          <w:sz w:val="22"/>
+          <w:szCs w:val="22"/>
+          <w:lang w:val="en-US"/>
+        </w:rPr>
+        <w:t>post-verification</w:t>
       </w:r>
       <w:r>
-        <w:br w:type="textWrapping"/>
+        <w:rPr>
+          <w:rFonts w:ascii="Calibri" w:hAnsi="Calibri" w:eastAsia="Calibri" w:cs="Calibri"/>
+          <w:sz w:val="22"/>
+          <w:szCs w:val="22"/>
+          <w:lang w:val="en-US"/>
+        </w:rPr>
+        <w:t xml:space="preserve"> để phát hiện lỗi:</w:t>
+      </w:r>
+    </w:p>
+    <w:p>
+      <w:pPr>
+        <w:pStyle w:val="143"/>
+        <w:numPr>
+          <w:ilvl w:val="1"/>
+          <w:numId w:val="8"/>
+        </w:numPr>
+        <w:spacing w:before="240" w:beforeAutospacing="0" w:after="240" w:afterAutospacing="0"/>
+        <w:rPr>
+          <w:rFonts w:ascii="Calibri" w:hAnsi="Calibri" w:eastAsia="Calibri" w:cs="Calibri"/>
+          <w:sz w:val="22"/>
+          <w:szCs w:val="22"/>
+          <w:lang w:val="en-US"/>
+        </w:rPr>
+      </w:pPr>
+      <w:r>
+        <w:rPr>
+          <w:rFonts w:ascii="Calibri" w:hAnsi="Calibri" w:eastAsia="Calibri" w:cs="Calibri"/>
+          <w:sz w:val="22"/>
+          <w:szCs w:val="22"/>
+          <w:lang w:val="en-US"/>
+        </w:rPr>
+        <w:t>Inventory inconsistency</w:t>
+      </w:r>
+    </w:p>
+    <w:p>
+      <w:pPr>
+        <w:pStyle w:val="143"/>
+        <w:numPr>
+          <w:ilvl w:val="1"/>
+          <w:numId w:val="8"/>
+        </w:numPr>
+        <w:spacing w:before="240" w:beforeAutospacing="0" w:after="240" w:afterAutospacing="0"/>
+        <w:rPr>
+          <w:rFonts w:ascii="Calibri" w:hAnsi="Calibri" w:eastAsia="Calibri" w:cs="Calibri"/>
+          <w:sz w:val="22"/>
+          <w:szCs w:val="22"/>
+          <w:lang w:val="en-US"/>
+        </w:rPr>
+      </w:pPr>
+      <w:r>
+        <w:rPr>
+          <w:rFonts w:ascii="Calibri" w:hAnsi="Calibri" w:eastAsia="Calibri" w:cs="Calibri"/>
+          <w:sz w:val="22"/>
+          <w:szCs w:val="22"/>
+          <w:lang w:val="en-US"/>
+        </w:rPr>
+        <w:t>Double dispensing</w:t>
+      </w:r>
+    </w:p>
+    <w:p>
+      <w:pPr>
+        <w:pStyle w:val="143"/>
+        <w:numPr>
+          <w:ilvl w:val="1"/>
+          <w:numId w:val="8"/>
+        </w:numPr>
+        <w:spacing w:before="240" w:beforeAutospacing="0" w:after="240" w:afterAutospacing="0"/>
+        <w:rPr>
+          <w:rFonts w:ascii="Calibri" w:hAnsi="Calibri" w:eastAsia="Calibri" w:cs="Calibri"/>
+          <w:sz w:val="22"/>
+          <w:szCs w:val="22"/>
+          <w:lang w:val="en-US"/>
+        </w:rPr>
+      </w:pPr>
+      <w:r>
+        <w:rPr>
+          <w:rFonts w:ascii="Calibri" w:hAnsi="Calibri" w:eastAsia="Calibri" w:cs="Calibri"/>
+          <w:sz w:val="22"/>
+          <w:szCs w:val="22"/>
+          <w:lang w:val="en-US"/>
+        </w:rPr>
+        <w:t>Expired batch dispensed</w:t>
+      </w:r>
+    </w:p>
+    <w:p>
+      <w:pPr>
+        <w:pStyle w:val="163"/>
+      </w:pPr>
+      <w:r>
+        <w:rPr>
+          <w:rFonts w:hint="default"/>
+          <w:lang w:val="en-US"/>
+        </w:rPr>
+        <w:t>4</w:t>
       </w:r>
       <w:r>
-        <w:t>• Kết luận cuối: [Cơ chế X thỏa đồng thời 2 điều kiện: 0% lỗi và avg &lt; 100ms / hoặc không cơ chế nào thỏa].</w:t>
+        <w:rPr>
+          <w:lang w:val="en-US"/>
+        </w:rPr>
+        <w:t>.3. Kết quả thực nghiệm</w:t>
       </w:r>
     </w:p>
+    <w:p>
+      <w:pPr>
+        <w:spacing w:before="299" w:beforeAutospacing="0" w:after="299" w:afterAutospacing="0"/>
+      </w:pPr>
+      <w:r>
+        <w:drawing>
+          <wp:inline distT="0" distB="0" distL="114300" distR="114300">
+            <wp:extent cx="5486400" cy="2886075"/>
+            <wp:effectExtent l="0" t="0" r="0" b="0"/>
+            <wp:docPr id="2075273027" name="drawing"/>
+            <wp:cNvGraphicFramePr>
+              <a:graphicFrameLocks xmlns:a="http://schemas.openxmlformats.org/drawingml/2006/main" noChangeAspect="1"/>
+            </wp:cNvGraphicFramePr>
+            <a:graphic xmlns:a="http://schemas.openxmlformats.org/drawingml/2006/main">
+              <a:graphicData uri="http://schemas.openxmlformats.org/drawingml/2006/picture">
+                <pic:pic xmlns:pic="http://schemas.openxmlformats.org/drawingml/2006/picture">
+                  <pic:nvPicPr>
+                    <pic:cNvPr id="2075273027" name="drawing"/>
+                    <pic:cNvPicPr>
+                      <a:picLocks noChangeAspect="1"/>
+                    </pic:cNvPicPr>
+                  </pic:nvPicPr>
+                  <pic:blipFill>
+                    <a:blip r:embed="rId19"/>
+                    <a:stretch>
+                      <a:fillRect/>
+                    </a:stretch>
+                  </pic:blipFill>
+                  <pic:spPr>
+                    <a:xfrm>
+                      <a:off x="0" y="0"/>
+                      <a:ext cx="5486400" cy="2886075"/>
+                    </a:xfrm>
+                    <a:prstGeom prst="rect">
+                      <a:avLst/>
+                    </a:prstGeom>
+                  </pic:spPr>
+                </pic:pic>
+              </a:graphicData>
+            </a:graphic>
+          </wp:inline>
+        </w:drawing>
+      </w:r>
+    </w:p>
+    <w:p>
+      <w:pPr>
+        <w:spacing w:before="299" w:beforeAutospacing="0" w:after="299" w:afterAutospacing="0"/>
+      </w:pPr>
+      <w:r>
+        <w:rPr>
+          <w:rStyle w:val="138"/>
+          <w:rFonts w:hint="default"/>
+          <w:lang w:val="en-US"/>
+        </w:rPr>
+        <w:t>4</w:t>
+      </w:r>
+      <w:r>
+        <w:rPr>
+          <w:rStyle w:val="138"/>
+          <w:lang w:val="en-US"/>
+        </w:rPr>
+        <w:t>.4. Phân tích</w:t>
+      </w:r>
+    </w:p>
+    <w:p>
+      <w:pPr>
+        <w:pStyle w:val="143"/>
+        <w:numPr>
+          <w:ilvl w:val="0"/>
+          <w:numId w:val="9"/>
+        </w:numPr>
+        <w:spacing w:before="240" w:beforeAutospacing="0" w:after="240" w:afterAutospacing="0"/>
+        <w:rPr>
+          <w:rFonts w:ascii="Calibri" w:hAnsi="Calibri" w:eastAsia="Calibri" w:cs="Calibri"/>
+          <w:sz w:val="22"/>
+          <w:szCs w:val="22"/>
+          <w:lang w:val="en-US"/>
+        </w:rPr>
+      </w:pPr>
+      <w:r>
+        <w:rPr>
+          <w:rFonts w:ascii="Calibri" w:hAnsi="Calibri" w:eastAsia="Calibri" w:cs="Calibri"/>
+          <w:b/>
+          <w:bCs/>
+          <w:sz w:val="22"/>
+          <w:szCs w:val="22"/>
+          <w:lang w:val="en-US"/>
+        </w:rPr>
+        <w:t>NO_LOCK</w:t>
+      </w:r>
+      <w:r>
+        <w:rPr>
+          <w:rFonts w:ascii="Calibri" w:hAnsi="Calibri" w:eastAsia="Calibri" w:cs="Calibri"/>
+          <w:sz w:val="22"/>
+          <w:szCs w:val="22"/>
+          <w:lang w:val="en-US"/>
+        </w:rPr>
+        <w:t>: tốc độ nhanh (28ms) nhưng dữ liệu sai → tồn kho lệch 4 hộp, chỉ 5 đơn thành công.</w:t>
+      </w:r>
+    </w:p>
+    <w:p>
+      <w:pPr>
+        <w:pStyle w:val="143"/>
+        <w:numPr>
+          <w:ilvl w:val="0"/>
+          <w:numId w:val="9"/>
+        </w:numPr>
+        <w:spacing w:before="240" w:beforeAutospacing="0" w:after="240" w:afterAutospacing="0"/>
+        <w:rPr>
+          <w:rFonts w:ascii="Calibri" w:hAnsi="Calibri" w:eastAsia="Calibri" w:cs="Calibri"/>
+          <w:sz w:val="22"/>
+          <w:szCs w:val="22"/>
+          <w:lang w:val="en-US"/>
+        </w:rPr>
+      </w:pPr>
+      <w:r>
+        <w:rPr>
+          <w:rFonts w:ascii="Calibri" w:hAnsi="Calibri" w:eastAsia="Calibri" w:cs="Calibri"/>
+          <w:b/>
+          <w:bCs/>
+          <w:sz w:val="22"/>
+          <w:szCs w:val="22"/>
+          <w:lang w:val="en-US"/>
+        </w:rPr>
+        <w:t>SYNC</w:t>
+      </w:r>
+      <w:r>
+        <w:rPr>
+          <w:rFonts w:ascii="Calibri" w:hAnsi="Calibri" w:eastAsia="Calibri" w:cs="Calibri"/>
+          <w:sz w:val="22"/>
+          <w:szCs w:val="22"/>
+          <w:lang w:val="en-US"/>
+        </w:rPr>
+        <w:t>: an toàn, không lỗi, nhưng chỉ xử lý được 1 đơn do tất cả thread phải chờ nhau.</w:t>
+      </w:r>
+    </w:p>
+    <w:p>
+      <w:pPr>
+        <w:pStyle w:val="143"/>
+        <w:numPr>
+          <w:ilvl w:val="0"/>
+          <w:numId w:val="9"/>
+        </w:numPr>
+        <w:spacing w:before="240" w:beforeAutospacing="0" w:after="240" w:afterAutospacing="0"/>
+        <w:rPr>
+          <w:rFonts w:ascii="Calibri" w:hAnsi="Calibri" w:eastAsia="Calibri" w:cs="Calibri"/>
+          <w:sz w:val="22"/>
+          <w:szCs w:val="22"/>
+          <w:lang w:val="en-US"/>
+        </w:rPr>
+      </w:pPr>
+      <w:r>
+        <w:rPr>
+          <w:rFonts w:ascii="Calibri" w:hAnsi="Calibri" w:eastAsia="Calibri" w:cs="Calibri"/>
+          <w:b/>
+          <w:bCs/>
+          <w:sz w:val="22"/>
+          <w:szCs w:val="22"/>
+          <w:lang w:val="en-US"/>
+        </w:rPr>
+        <w:t>OPTIMISTIC</w:t>
+      </w:r>
+      <w:r>
+        <w:rPr>
+          <w:rFonts w:ascii="Calibri" w:hAnsi="Calibri" w:eastAsia="Calibri" w:cs="Calibri"/>
+          <w:sz w:val="22"/>
+          <w:szCs w:val="22"/>
+          <w:lang w:val="en-US"/>
+        </w:rPr>
+        <w:t>: không lỗi, nhưng thời gian cao nhất (187ms) do retry nhiều lần.</w:t>
+      </w:r>
+    </w:p>
+    <w:p>
+      <w:pPr>
+        <w:pStyle w:val="143"/>
+        <w:numPr>
+          <w:ilvl w:val="0"/>
+          <w:numId w:val="9"/>
+        </w:numPr>
+        <w:spacing w:before="240" w:beforeAutospacing="0" w:after="240" w:afterAutospacing="0"/>
+        <w:rPr>
+          <w:rFonts w:ascii="Calibri" w:hAnsi="Calibri" w:eastAsia="Calibri" w:cs="Calibri"/>
+          <w:sz w:val="22"/>
+          <w:szCs w:val="22"/>
+          <w:lang w:val="en-US"/>
+        </w:rPr>
+      </w:pPr>
+      <w:r>
+        <w:rPr>
+          <w:rFonts w:ascii="Calibri" w:hAnsi="Calibri" w:eastAsia="Calibri" w:cs="Calibri"/>
+          <w:b/>
+          <w:bCs/>
+          <w:sz w:val="22"/>
+          <w:szCs w:val="22"/>
+          <w:lang w:val="en-US"/>
+        </w:rPr>
+        <w:t>FILE_LOCK</w:t>
+      </w:r>
+      <w:r>
+        <w:rPr>
+          <w:rFonts w:ascii="Calibri" w:hAnsi="Calibri" w:eastAsia="Calibri" w:cs="Calibri"/>
+          <w:sz w:val="22"/>
+          <w:szCs w:val="22"/>
+          <w:lang w:val="en-US"/>
+        </w:rPr>
+        <w:t>: an toàn, thời gian trung bình (48ms), nhưng cũng chỉ xử lý được 1 đơn.</w:t>
+      </w:r>
+    </w:p>
+    <w:p>
+      <w:pPr>
+        <w:pStyle w:val="3"/>
+        <w:spacing w:before="299" w:beforeAutospacing="0" w:after="299" w:afterAutospacing="0"/>
+        <w:rPr>
+          <w:b/>
+          <w:bCs/>
+          <w:sz w:val="28"/>
+          <w:szCs w:val="28"/>
+        </w:rPr>
+      </w:pPr>
+      <w:r>
+        <w:rPr>
+          <w:rFonts w:hint="default" w:ascii="Calibri" w:hAnsi="Calibri" w:eastAsia="Calibri" w:cs="Calibri"/>
+          <w:b/>
+          <w:bCs/>
+          <w:sz w:val="28"/>
+          <w:szCs w:val="28"/>
+          <w:lang w:val="en-US"/>
+        </w:rPr>
+        <w:t>4</w:t>
+      </w:r>
+      <w:r>
+        <w:rPr>
+          <w:rFonts w:ascii="Calibri" w:hAnsi="Calibri" w:eastAsia="Calibri" w:cs="Calibri"/>
+          <w:b/>
+          <w:bCs/>
+          <w:sz w:val="28"/>
+          <w:szCs w:val="28"/>
+          <w:lang w:val="en-US"/>
+        </w:rPr>
+        <w:t>.5. Kết luận</w:t>
+      </w:r>
+    </w:p>
+    <w:p>
+      <w:pPr>
+        <w:pStyle w:val="143"/>
+        <w:numPr>
+          <w:ilvl w:val="0"/>
+          <w:numId w:val="10"/>
+        </w:numPr>
+        <w:spacing w:before="240" w:beforeAutospacing="0" w:after="240" w:afterAutospacing="0"/>
+        <w:rPr>
+          <w:rFonts w:ascii="Calibri" w:hAnsi="Calibri" w:eastAsia="Calibri" w:cs="Calibri"/>
+          <w:sz w:val="22"/>
+          <w:szCs w:val="22"/>
+          <w:lang w:val="en-US"/>
+        </w:rPr>
+      </w:pPr>
+      <w:r>
+        <w:rPr>
+          <w:rFonts w:ascii="Calibri" w:hAnsi="Calibri" w:eastAsia="Calibri" w:cs="Calibri"/>
+          <w:b/>
+          <w:bCs/>
+          <w:sz w:val="22"/>
+          <w:szCs w:val="22"/>
+          <w:lang w:val="en-US"/>
+        </w:rPr>
+        <w:t>NO_LOCK</w:t>
+      </w:r>
+      <w:r>
+        <w:rPr>
+          <w:rFonts w:ascii="Calibri" w:hAnsi="Calibri" w:eastAsia="Calibri" w:cs="Calibri"/>
+          <w:sz w:val="22"/>
+          <w:szCs w:val="22"/>
+          <w:lang w:val="en-US"/>
+        </w:rPr>
+        <w:t xml:space="preserve"> không thể dùng thực tế vì gây lỗi nghiêm trọng.</w:t>
+      </w:r>
+    </w:p>
+    <w:p>
+      <w:pPr>
+        <w:pStyle w:val="143"/>
+        <w:numPr>
+          <w:ilvl w:val="0"/>
+          <w:numId w:val="10"/>
+        </w:numPr>
+        <w:spacing w:before="240" w:beforeAutospacing="0" w:after="240" w:afterAutospacing="0"/>
+        <w:rPr>
+          <w:rFonts w:ascii="Calibri" w:hAnsi="Calibri" w:eastAsia="Calibri" w:cs="Calibri"/>
+          <w:sz w:val="22"/>
+          <w:szCs w:val="22"/>
+          <w:lang w:val="en-US"/>
+        </w:rPr>
+      </w:pPr>
+      <w:r>
+        <w:rPr>
+          <w:rFonts w:ascii="Calibri" w:hAnsi="Calibri" w:eastAsia="Calibri" w:cs="Calibri"/>
+          <w:b/>
+          <w:bCs/>
+          <w:sz w:val="22"/>
+          <w:szCs w:val="22"/>
+          <w:lang w:val="en-US"/>
+        </w:rPr>
+        <w:t>SYNC</w:t>
+      </w:r>
+      <w:r>
+        <w:rPr>
+          <w:rFonts w:ascii="Calibri" w:hAnsi="Calibri" w:eastAsia="Calibri" w:cs="Calibri"/>
+          <w:sz w:val="22"/>
+          <w:szCs w:val="22"/>
+          <w:lang w:val="en-US"/>
+        </w:rPr>
+        <w:t xml:space="preserve"> và </w:t>
+      </w:r>
+      <w:r>
+        <w:rPr>
+          <w:rFonts w:ascii="Calibri" w:hAnsi="Calibri" w:eastAsia="Calibri" w:cs="Calibri"/>
+          <w:b/>
+          <w:bCs/>
+          <w:sz w:val="22"/>
+          <w:szCs w:val="22"/>
+          <w:lang w:val="en-US"/>
+        </w:rPr>
+        <w:t>FILE_LOCK</w:t>
+      </w:r>
+      <w:r>
+        <w:rPr>
+          <w:rFonts w:ascii="Calibri" w:hAnsi="Calibri" w:eastAsia="Calibri" w:cs="Calibri"/>
+          <w:sz w:val="22"/>
+          <w:szCs w:val="22"/>
+          <w:lang w:val="en-US"/>
+        </w:rPr>
+        <w:t xml:space="preserve"> đảm bảo an toàn nhưng hiệu suất thấp.</w:t>
+      </w:r>
+    </w:p>
+    <w:p>
+      <w:pPr>
+        <w:pStyle w:val="143"/>
+        <w:numPr>
+          <w:ilvl w:val="0"/>
+          <w:numId w:val="10"/>
+        </w:numPr>
+        <w:spacing w:before="240" w:beforeAutospacing="0" w:after="240" w:afterAutospacing="0"/>
+        <w:rPr>
+          <w:rFonts w:ascii="Calibri" w:hAnsi="Calibri" w:eastAsia="Calibri" w:cs="Calibri"/>
+          <w:sz w:val="22"/>
+          <w:szCs w:val="22"/>
+          <w:lang w:val="en-US"/>
+        </w:rPr>
+      </w:pPr>
+      <w:r>
+        <w:rPr>
+          <w:rFonts w:ascii="Calibri" w:hAnsi="Calibri" w:eastAsia="Calibri" w:cs="Calibri"/>
+          <w:b/>
+          <w:bCs/>
+          <w:sz w:val="22"/>
+          <w:szCs w:val="22"/>
+          <w:lang w:val="en-US"/>
+        </w:rPr>
+        <w:t>OPTIMISTIC</w:t>
+      </w:r>
+      <w:r>
+        <w:rPr>
+          <w:rFonts w:ascii="Calibri" w:hAnsi="Calibri" w:eastAsia="Calibri" w:cs="Calibri"/>
+          <w:sz w:val="22"/>
+          <w:szCs w:val="22"/>
+          <w:lang w:val="en-US"/>
+        </w:rPr>
+        <w:t xml:space="preserve"> tuy chậm hơn nhưng vẫn đảm bảo dữ liệu chính xác, phù hợp cho hệ thống lớn.</w:t>
+      </w:r>
+    </w:p>
+    <w:p>
+      <w:pPr>
+        <w:pStyle w:val="143"/>
+        <w:numPr>
+          <w:ilvl w:val="0"/>
+          <w:numId w:val="10"/>
+        </w:numPr>
+        <w:spacing w:before="240" w:beforeAutospacing="0" w:after="240" w:afterAutospacing="0"/>
+        <w:rPr>
+          <w:rFonts w:ascii="Calibri" w:hAnsi="Calibri" w:eastAsia="Calibri" w:cs="Calibri"/>
+          <w:sz w:val="22"/>
+          <w:szCs w:val="22"/>
+          <w:lang w:val="en-US"/>
+        </w:rPr>
+      </w:pPr>
+      <w:r>
+        <w:rPr>
+          <w:rFonts w:ascii="Calibri" w:hAnsi="Calibri" w:eastAsia="Calibri" w:cs="Calibri"/>
+          <w:sz w:val="22"/>
+          <w:szCs w:val="22"/>
+          <w:lang w:val="en-US"/>
+        </w:rPr>
+        <w:t>C</w:t>
+      </w:r>
+      <w:r>
+        <w:rPr>
+          <w:rFonts w:ascii="Calibri" w:hAnsi="Calibri" w:eastAsia="Calibri" w:cs="Calibri"/>
+          <w:b/>
+          <w:bCs/>
+          <w:sz w:val="22"/>
+          <w:szCs w:val="22"/>
+          <w:lang w:val="en-US"/>
+        </w:rPr>
+        <w:t>ơ chế đồng bộ là bắt buộc</w:t>
+      </w:r>
+      <w:r>
+        <w:rPr>
+          <w:rFonts w:ascii="Calibri" w:hAnsi="Calibri" w:eastAsia="Calibri" w:cs="Calibri"/>
+          <w:sz w:val="22"/>
+          <w:szCs w:val="22"/>
+          <w:lang w:val="en-US"/>
+        </w:rPr>
+        <w:t xml:space="preserve"> để đảm bảo tính toàn vẹn dữ liệu, và </w:t>
+      </w:r>
+      <w:r>
+        <w:rPr>
+          <w:rFonts w:ascii="Calibri" w:hAnsi="Calibri" w:eastAsia="Calibri" w:cs="Calibri"/>
+          <w:b/>
+          <w:bCs/>
+          <w:sz w:val="22"/>
+          <w:szCs w:val="22"/>
+          <w:lang w:val="en-US"/>
+        </w:rPr>
+        <w:t>OPTIMISTIC LOCKING</w:t>
+      </w:r>
+      <w:r>
+        <w:rPr>
+          <w:rFonts w:ascii="Calibri" w:hAnsi="Calibri" w:eastAsia="Calibri" w:cs="Calibri"/>
+          <w:sz w:val="22"/>
+          <w:szCs w:val="22"/>
+          <w:lang w:val="en-US"/>
+        </w:rPr>
+        <w:t xml:space="preserve"> là lựa chọn cân bằng nhất.</w:t>
+      </w:r>
+    </w:p>
+    <w:p/>
     <w:sectPr>
       <w:pgSz w:w="12240" w:h="15840"/>
       <w:pgMar w:top="1440" w:right="1800" w:bottom="1440" w:left="1800" w:header="720" w:footer="720" w:gutter="0"/>
@@ -1896,6 +2564,458 @@
       </w:rPr>
     </w:lvl>
   </w:abstractNum>
+  <w:abstractNum w:abstractNumId="6">
+    <w:nsid w:val="0EF187A9"/>
+    <w:multiLevelType w:val="multilevel"/>
+    <w:tmpl w:val="0EF187A9"/>
+    <w:lvl w:ilvl="0" w:tentative="0">
+      <w:start w:val="1"/>
+      <w:numFmt w:val="bullet"/>
+      <w:lvlText w:val=""/>
+      <w:lvlJc w:val="left"/>
+      <w:pPr>
+        <w:ind w:left="720" w:hanging="360"/>
+      </w:pPr>
+      <w:rPr>
+        <w:rFonts w:hint="default" w:ascii="Symbol" w:hAnsi="Symbol"/>
+      </w:rPr>
+    </w:lvl>
+    <w:lvl w:ilvl="1" w:tentative="0">
+      <w:start w:val="1"/>
+      <w:numFmt w:val="bullet"/>
+      <w:lvlText w:val="o"/>
+      <w:lvlJc w:val="left"/>
+      <w:pPr>
+        <w:ind w:left="1440" w:hanging="360"/>
+      </w:pPr>
+      <w:rPr>
+        <w:rFonts w:hint="default" w:ascii="Courier New" w:hAnsi="Courier New"/>
+      </w:rPr>
+    </w:lvl>
+    <w:lvl w:ilvl="2" w:tentative="0">
+      <w:start w:val="1"/>
+      <w:numFmt w:val="bullet"/>
+      <w:lvlText w:val=""/>
+      <w:lvlJc w:val="left"/>
+      <w:pPr>
+        <w:ind w:left="2160" w:hanging="360"/>
+      </w:pPr>
+      <w:rPr>
+        <w:rFonts w:hint="default" w:ascii="Wingdings" w:hAnsi="Wingdings"/>
+      </w:rPr>
+    </w:lvl>
+    <w:lvl w:ilvl="3" w:tentative="0">
+      <w:start w:val="1"/>
+      <w:numFmt w:val="bullet"/>
+      <w:lvlText w:val=""/>
+      <w:lvlJc w:val="left"/>
+      <w:pPr>
+        <w:ind w:left="2880" w:hanging="360"/>
+      </w:pPr>
+      <w:rPr>
+        <w:rFonts w:hint="default" w:ascii="Symbol" w:hAnsi="Symbol"/>
+      </w:rPr>
+    </w:lvl>
+    <w:lvl w:ilvl="4" w:tentative="0">
+      <w:start w:val="1"/>
+      <w:numFmt w:val="bullet"/>
+      <w:lvlText w:val="o"/>
+      <w:lvlJc w:val="left"/>
+      <w:pPr>
+        <w:ind w:left="3600" w:hanging="360"/>
+      </w:pPr>
+      <w:rPr>
+        <w:rFonts w:hint="default" w:ascii="Courier New" w:hAnsi="Courier New"/>
+      </w:rPr>
+    </w:lvl>
+    <w:lvl w:ilvl="5" w:tentative="0">
+      <w:start w:val="1"/>
+      <w:numFmt w:val="bullet"/>
+      <w:lvlText w:val=""/>
+      <w:lvlJc w:val="left"/>
+      <w:pPr>
+        <w:ind w:left="4320" w:hanging="360"/>
+      </w:pPr>
+      <w:rPr>
+        <w:rFonts w:hint="default" w:ascii="Wingdings" w:hAnsi="Wingdings"/>
+      </w:rPr>
+    </w:lvl>
+    <w:lvl w:ilvl="6" w:tentative="0">
+      <w:start w:val="1"/>
+      <w:numFmt w:val="bullet"/>
+      <w:lvlText w:val=""/>
+      <w:lvlJc w:val="left"/>
+      <w:pPr>
+        <w:ind w:left="5040" w:hanging="360"/>
+      </w:pPr>
+      <w:rPr>
+        <w:rFonts w:hint="default" w:ascii="Symbol" w:hAnsi="Symbol"/>
+      </w:rPr>
+    </w:lvl>
+    <w:lvl w:ilvl="7" w:tentative="0">
+      <w:start w:val="1"/>
+      <w:numFmt w:val="bullet"/>
+      <w:lvlText w:val="o"/>
+      <w:lvlJc w:val="left"/>
+      <w:pPr>
+        <w:ind w:left="5760" w:hanging="360"/>
+      </w:pPr>
+      <w:rPr>
+        <w:rFonts w:hint="default" w:ascii="Courier New" w:hAnsi="Courier New"/>
+      </w:rPr>
+    </w:lvl>
+    <w:lvl w:ilvl="8" w:tentative="0">
+      <w:start w:val="1"/>
+      <w:numFmt w:val="bullet"/>
+      <w:lvlText w:val=""/>
+      <w:lvlJc w:val="left"/>
+      <w:pPr>
+        <w:ind w:left="6480" w:hanging="360"/>
+      </w:pPr>
+      <w:rPr>
+        <w:rFonts w:hint="default" w:ascii="Wingdings" w:hAnsi="Wingdings"/>
+      </w:rPr>
+    </w:lvl>
+  </w:abstractNum>
+  <w:abstractNum w:abstractNumId="7">
+    <w:nsid w:val="11B406D7"/>
+    <w:multiLevelType w:val="multilevel"/>
+    <w:tmpl w:val="11B406D7"/>
+    <w:lvl w:ilvl="0" w:tentative="0">
+      <w:start w:val="1"/>
+      <w:numFmt w:val="bullet"/>
+      <w:lvlText w:val=""/>
+      <w:lvlJc w:val="left"/>
+      <w:pPr>
+        <w:ind w:left="720" w:hanging="360"/>
+      </w:pPr>
+      <w:rPr>
+        <w:rFonts w:hint="default" w:ascii="Symbol" w:hAnsi="Symbol"/>
+      </w:rPr>
+    </w:lvl>
+    <w:lvl w:ilvl="1" w:tentative="0">
+      <w:start w:val="1"/>
+      <w:numFmt w:val="bullet"/>
+      <w:lvlText w:val="o"/>
+      <w:lvlJc w:val="left"/>
+      <w:pPr>
+        <w:ind w:left="1440" w:hanging="360"/>
+      </w:pPr>
+      <w:rPr>
+        <w:rFonts w:hint="default" w:ascii="Courier New" w:hAnsi="Courier New"/>
+      </w:rPr>
+    </w:lvl>
+    <w:lvl w:ilvl="2" w:tentative="0">
+      <w:start w:val="1"/>
+      <w:numFmt w:val="bullet"/>
+      <w:lvlText w:val=""/>
+      <w:lvlJc w:val="left"/>
+      <w:pPr>
+        <w:ind w:left="2160" w:hanging="360"/>
+      </w:pPr>
+      <w:rPr>
+        <w:rFonts w:hint="default" w:ascii="Wingdings" w:hAnsi="Wingdings"/>
+      </w:rPr>
+    </w:lvl>
+    <w:lvl w:ilvl="3" w:tentative="0">
+      <w:start w:val="1"/>
+      <w:numFmt w:val="bullet"/>
+      <w:lvlText w:val=""/>
+      <w:lvlJc w:val="left"/>
+      <w:pPr>
+        <w:ind w:left="2880" w:hanging="360"/>
+      </w:pPr>
+      <w:rPr>
+        <w:rFonts w:hint="default" w:ascii="Symbol" w:hAnsi="Symbol"/>
+      </w:rPr>
+    </w:lvl>
+    <w:lvl w:ilvl="4" w:tentative="0">
+      <w:start w:val="1"/>
+      <w:numFmt w:val="bullet"/>
+      <w:lvlText w:val="o"/>
+      <w:lvlJc w:val="left"/>
+      <w:pPr>
+        <w:ind w:left="3600" w:hanging="360"/>
+      </w:pPr>
+      <w:rPr>
+        <w:rFonts w:hint="default" w:ascii="Courier New" w:hAnsi="Courier New"/>
+      </w:rPr>
+    </w:lvl>
+    <w:lvl w:ilvl="5" w:tentative="0">
+      <w:start w:val="1"/>
+      <w:numFmt w:val="bullet"/>
+      <w:lvlText w:val=""/>
+      <w:lvlJc w:val="left"/>
+      <w:pPr>
+        <w:ind w:left="4320" w:hanging="360"/>
+      </w:pPr>
+      <w:rPr>
+        <w:rFonts w:hint="default" w:ascii="Wingdings" w:hAnsi="Wingdings"/>
+      </w:rPr>
+    </w:lvl>
+    <w:lvl w:ilvl="6" w:tentative="0">
+      <w:start w:val="1"/>
+      <w:numFmt w:val="bullet"/>
+      <w:lvlText w:val=""/>
+      <w:lvlJc w:val="left"/>
+      <w:pPr>
+        <w:ind w:left="5040" w:hanging="360"/>
+      </w:pPr>
+      <w:rPr>
+        <w:rFonts w:hint="default" w:ascii="Symbol" w:hAnsi="Symbol"/>
+      </w:rPr>
+    </w:lvl>
+    <w:lvl w:ilvl="7" w:tentative="0">
+      <w:start w:val="1"/>
+      <w:numFmt w:val="bullet"/>
+      <w:lvlText w:val="o"/>
+      <w:lvlJc w:val="left"/>
+      <w:pPr>
+        <w:ind w:left="5760" w:hanging="360"/>
+      </w:pPr>
+      <w:rPr>
+        <w:rFonts w:hint="default" w:ascii="Courier New" w:hAnsi="Courier New"/>
+      </w:rPr>
+    </w:lvl>
+    <w:lvl w:ilvl="8" w:tentative="0">
+      <w:start w:val="1"/>
+      <w:numFmt w:val="bullet"/>
+      <w:lvlText w:val=""/>
+      <w:lvlJc w:val="left"/>
+      <w:pPr>
+        <w:ind w:left="6480" w:hanging="360"/>
+      </w:pPr>
+      <w:rPr>
+        <w:rFonts w:hint="default" w:ascii="Wingdings" w:hAnsi="Wingdings"/>
+      </w:rPr>
+    </w:lvl>
+  </w:abstractNum>
+  <w:abstractNum w:abstractNumId="8">
+    <w:nsid w:val="2DD99A39"/>
+    <w:multiLevelType w:val="multilevel"/>
+    <w:tmpl w:val="2DD99A39"/>
+    <w:lvl w:ilvl="0" w:tentative="0">
+      <w:start w:val="1"/>
+      <w:numFmt w:val="bullet"/>
+      <w:lvlText w:val=""/>
+      <w:lvlJc w:val="left"/>
+      <w:pPr>
+        <w:ind w:left="720" w:hanging="360"/>
+      </w:pPr>
+      <w:rPr>
+        <w:rFonts w:hint="default" w:ascii="Symbol" w:hAnsi="Symbol"/>
+      </w:rPr>
+    </w:lvl>
+    <w:lvl w:ilvl="1" w:tentative="0">
+      <w:start w:val="1"/>
+      <w:numFmt w:val="bullet"/>
+      <w:lvlText w:val="o"/>
+      <w:lvlJc w:val="left"/>
+      <w:pPr>
+        <w:ind w:left="1440" w:hanging="360"/>
+      </w:pPr>
+      <w:rPr>
+        <w:rFonts w:hint="default" w:ascii="Courier New" w:hAnsi="Courier New"/>
+      </w:rPr>
+    </w:lvl>
+    <w:lvl w:ilvl="2" w:tentative="0">
+      <w:start w:val="1"/>
+      <w:numFmt w:val="bullet"/>
+      <w:lvlText w:val=""/>
+      <w:lvlJc w:val="left"/>
+      <w:pPr>
+        <w:ind w:left="2160" w:hanging="360"/>
+      </w:pPr>
+      <w:rPr>
+        <w:rFonts w:hint="default" w:ascii="Wingdings" w:hAnsi="Wingdings"/>
+      </w:rPr>
+    </w:lvl>
+    <w:lvl w:ilvl="3" w:tentative="0">
+      <w:start w:val="1"/>
+      <w:numFmt w:val="bullet"/>
+      <w:lvlText w:val=""/>
+      <w:lvlJc w:val="left"/>
+      <w:pPr>
+        <w:ind w:left="2880" w:hanging="360"/>
+      </w:pPr>
+      <w:rPr>
+        <w:rFonts w:hint="default" w:ascii="Symbol" w:hAnsi="Symbol"/>
+      </w:rPr>
+    </w:lvl>
+    <w:lvl w:ilvl="4" w:tentative="0">
+      <w:start w:val="1"/>
+      <w:numFmt w:val="bullet"/>
+      <w:lvlText w:val="o"/>
+      <w:lvlJc w:val="left"/>
+      <w:pPr>
+        <w:ind w:left="3600" w:hanging="360"/>
+      </w:pPr>
+      <w:rPr>
+        <w:rFonts w:hint="default" w:ascii="Courier New" w:hAnsi="Courier New"/>
+      </w:rPr>
+    </w:lvl>
+    <w:lvl w:ilvl="5" w:tentative="0">
+      <w:start w:val="1"/>
+      <w:numFmt w:val="bullet"/>
+      <w:lvlText w:val=""/>
+      <w:lvlJc w:val="left"/>
+      <w:pPr>
+        <w:ind w:left="4320" w:hanging="360"/>
+      </w:pPr>
+      <w:rPr>
+        <w:rFonts w:hint="default" w:ascii="Wingdings" w:hAnsi="Wingdings"/>
+      </w:rPr>
+    </w:lvl>
+    <w:lvl w:ilvl="6" w:tentative="0">
+      <w:start w:val="1"/>
+      <w:numFmt w:val="bullet"/>
+      <w:lvlText w:val=""/>
+      <w:lvlJc w:val="left"/>
+      <w:pPr>
+        <w:ind w:left="5040" w:hanging="360"/>
+      </w:pPr>
+      <w:rPr>
+        <w:rFonts w:hint="default" w:ascii="Symbol" w:hAnsi="Symbol"/>
+      </w:rPr>
+    </w:lvl>
+    <w:lvl w:ilvl="7" w:tentative="0">
+      <w:start w:val="1"/>
+      <w:numFmt w:val="bullet"/>
+      <w:lvlText w:val="o"/>
+      <w:lvlJc w:val="left"/>
+      <w:pPr>
+        <w:ind w:left="5760" w:hanging="360"/>
+      </w:pPr>
+      <w:rPr>
+        <w:rFonts w:hint="default" w:ascii="Courier New" w:hAnsi="Courier New"/>
+      </w:rPr>
+    </w:lvl>
+    <w:lvl w:ilvl="8" w:tentative="0">
+      <w:start w:val="1"/>
+      <w:numFmt w:val="bullet"/>
+      <w:lvlText w:val=""/>
+      <w:lvlJc w:val="left"/>
+      <w:pPr>
+        <w:ind w:left="6480" w:hanging="360"/>
+      </w:pPr>
+      <w:rPr>
+        <w:rFonts w:hint="default" w:ascii="Wingdings" w:hAnsi="Wingdings"/>
+      </w:rPr>
+    </w:lvl>
+  </w:abstractNum>
+  <w:abstractNum w:abstractNumId="9">
+    <w:nsid w:val="35837C75"/>
+    <w:multiLevelType w:val="multilevel"/>
+    <w:tmpl w:val="35837C75"/>
+    <w:lvl w:ilvl="0" w:tentative="0">
+      <w:start w:val="1"/>
+      <w:numFmt w:val="bullet"/>
+      <w:lvlText w:val=""/>
+      <w:lvlJc w:val="left"/>
+      <w:pPr>
+        <w:ind w:left="720" w:hanging="360"/>
+      </w:pPr>
+      <w:rPr>
+        <w:rFonts w:hint="default" w:ascii="Symbol" w:hAnsi="Symbol"/>
+      </w:rPr>
+    </w:lvl>
+    <w:lvl w:ilvl="1" w:tentative="0">
+      <w:start w:val="1"/>
+      <w:numFmt w:val="bullet"/>
+      <w:lvlText w:val="o"/>
+      <w:lvlJc w:val="left"/>
+      <w:pPr>
+        <w:ind w:left="1440" w:hanging="360"/>
+      </w:pPr>
+      <w:rPr>
+        <w:rFonts w:hint="default" w:ascii="Courier New" w:hAnsi="Courier New"/>
+      </w:rPr>
+    </w:lvl>
+    <w:lvl w:ilvl="2" w:tentative="0">
+      <w:start w:val="1"/>
+      <w:numFmt w:val="bullet"/>
+      <w:lvlText w:val=""/>
+      <w:lvlJc w:val="left"/>
+      <w:pPr>
+        <w:ind w:left="2160" w:hanging="360"/>
+      </w:pPr>
+      <w:rPr>
+        <w:rFonts w:hint="default" w:ascii="Wingdings" w:hAnsi="Wingdings"/>
+      </w:rPr>
+    </w:lvl>
+    <w:lvl w:ilvl="3" w:tentative="0">
+      <w:start w:val="1"/>
+      <w:numFmt w:val="bullet"/>
+      <w:lvlText w:val=""/>
+      <w:lvlJc w:val="left"/>
+      <w:pPr>
+        <w:ind w:left="2880" w:hanging="360"/>
+      </w:pPr>
+      <w:rPr>
+        <w:rFonts w:hint="default" w:ascii="Symbol" w:hAnsi="Symbol"/>
+      </w:rPr>
+    </w:lvl>
+    <w:lvl w:ilvl="4" w:tentative="0">
+      <w:start w:val="1"/>
+      <w:numFmt w:val="bullet"/>
+      <w:lvlText w:val="o"/>
+      <w:lvlJc w:val="left"/>
+      <w:pPr>
+        <w:ind w:left="3600" w:hanging="360"/>
+      </w:pPr>
+      <w:rPr>
+        <w:rFonts w:hint="default" w:ascii="Courier New" w:hAnsi="Courier New"/>
+      </w:rPr>
+    </w:lvl>
+    <w:lvl w:ilvl="5" w:tentative="0">
+      <w:start w:val="1"/>
+      <w:numFmt w:val="bullet"/>
+      <w:lvlText w:val=""/>
+      <w:lvlJc w:val="left"/>
+      <w:pPr>
+        <w:ind w:left="4320" w:hanging="360"/>
+      </w:pPr>
+      <w:rPr>
+        <w:rFonts w:hint="default" w:ascii="Wingdings" w:hAnsi="Wingdings"/>
+      </w:rPr>
+    </w:lvl>
+    <w:lvl w:ilvl="6" w:tentative="0">
+      <w:start w:val="1"/>
+      <w:numFmt w:val="bullet"/>
+      <w:lvlText w:val=""/>
+      <w:lvlJc w:val="left"/>
+      <w:pPr>
+        <w:ind w:left="5040" w:hanging="360"/>
+      </w:pPr>
+      <w:rPr>
+        <w:rFonts w:hint="default" w:ascii="Symbol" w:hAnsi="Symbol"/>
+      </w:rPr>
+    </w:lvl>
+    <w:lvl w:ilvl="7" w:tentative="0">
+      <w:start w:val="1"/>
+      <w:numFmt w:val="bullet"/>
+      <w:lvlText w:val="o"/>
+      <w:lvlJc w:val="left"/>
+      <w:pPr>
+        <w:ind w:left="5760" w:hanging="360"/>
+      </w:pPr>
+      <w:rPr>
+        <w:rFonts w:hint="default" w:ascii="Courier New" w:hAnsi="Courier New"/>
+      </w:rPr>
+    </w:lvl>
+    <w:lvl w:ilvl="8" w:tentative="0">
+      <w:start w:val="1"/>
+      <w:numFmt w:val="bullet"/>
+      <w:lvlText w:val=""/>
+      <w:lvlJc w:val="left"/>
+      <w:pPr>
+        <w:ind w:left="6480" w:hanging="360"/>
+      </w:pPr>
+      <w:rPr>
+        <w:rFonts w:hint="default" w:ascii="Wingdings" w:hAnsi="Wingdings"/>
+      </w:rPr>
+    </w:lvl>
+  </w:abstractNum>
   <w:num w:numId="1">
     <w:abstractNumId w:val="5"/>
   </w:num>
@@ -1913,6 +3033,18 @@
   </w:num>
   <w:num w:numId="6">
     <w:abstractNumId w:val="0"/>
+  </w:num>
+  <w:num w:numId="7">
+    <w:abstractNumId w:val="9"/>
+  </w:num>
+  <w:num w:numId="8">
+    <w:abstractNumId w:val="8"/>
+  </w:num>
+  <w:num w:numId="9">
+    <w:abstractNumId w:val="7"/>
+  </w:num>
+  <w:num w:numId="10">
+    <w:abstractNumId w:val="6"/>
   </w:num>
 </w:numbering>
 </file>
@@ -1960,7 +3092,7 @@
     <w:lsdException w:uiPriority="99" w:name="footnote text"/>
     <w:lsdException w:uiPriority="99" w:name="annotation text"/>
     <w:lsdException w:qFormat="1" w:uiPriority="99" w:semiHidden="0" w:name="header"/>
-    <w:lsdException w:uiPriority="99" w:semiHidden="0" w:name="footer"/>
+    <w:lsdException w:qFormat="1" w:uiPriority="99" w:semiHidden="0" w:name="footer"/>
     <w:lsdException w:uiPriority="99" w:name="index heading"/>
     <w:lsdException w:qFormat="1" w:uiPriority="35" w:name="caption"/>
     <w:lsdException w:uiPriority="99" w:name="table of figures"/>
@@ -1975,30 +3107,30 @@
     <w:lsdException w:uiPriority="99" w:name="table of authorities"/>
     <w:lsdException w:uiPriority="99" w:semiHidden="0" w:name="macro"/>
     <w:lsdException w:uiPriority="99" w:name="toa heading"/>
-    <w:lsdException w:uiPriority="99" w:semiHidden="0" w:name="List"/>
-    <w:lsdException w:uiPriority="99" w:semiHidden="0" w:name="List Bullet"/>
-    <w:lsdException w:uiPriority="99" w:semiHidden="0" w:name="List Number"/>
-    <w:lsdException w:uiPriority="99" w:semiHidden="0" w:name="List 2"/>
-    <w:lsdException w:uiPriority="99" w:semiHidden="0" w:name="List 3"/>
+    <w:lsdException w:qFormat="1" w:uiPriority="99" w:semiHidden="0" w:name="List"/>
+    <w:lsdException w:qFormat="1" w:uiPriority="99" w:semiHidden="0" w:name="List Bullet"/>
+    <w:lsdException w:qFormat="1" w:uiPriority="99" w:semiHidden="0" w:name="List Number"/>
+    <w:lsdException w:qFormat="1" w:uiPriority="99" w:semiHidden="0" w:name="List 2"/>
+    <w:lsdException w:qFormat="1" w:uiPriority="99" w:semiHidden="0" w:name="List 3"/>
     <w:lsdException w:uiPriority="99" w:name="List 4"/>
     <w:lsdException w:uiPriority="99" w:name="List 5"/>
-    <w:lsdException w:uiPriority="99" w:semiHidden="0" w:name="List Bullet 2"/>
-    <w:lsdException w:uiPriority="99" w:semiHidden="0" w:name="List Bullet 3"/>
+    <w:lsdException w:qFormat="1" w:uiPriority="99" w:semiHidden="0" w:name="List Bullet 2"/>
+    <w:lsdException w:qFormat="1" w:uiPriority="99" w:semiHidden="0" w:name="List Bullet 3"/>
     <w:lsdException w:uiPriority="99" w:name="List Bullet 4"/>
     <w:lsdException w:uiPriority="99" w:name="List Bullet 5"/>
-    <w:lsdException w:uiPriority="99" w:semiHidden="0" w:name="List Number 2"/>
-    <w:lsdException w:uiPriority="99" w:semiHidden="0" w:name="List Number 3"/>
+    <w:lsdException w:qFormat="1" w:uiPriority="99" w:semiHidden="0" w:name="List Number 2"/>
+    <w:lsdException w:qFormat="1" w:uiPriority="99" w:semiHidden="0" w:name="List Number 3"/>
     <w:lsdException w:uiPriority="99" w:name="List Number 4"/>
     <w:lsdException w:uiPriority="99" w:name="List Number 5"/>
     <w:lsdException w:qFormat="1" w:unhideWhenUsed="0" w:uiPriority="10" w:semiHidden="0" w:name="Title"/>
     <w:lsdException w:uiPriority="99" w:name="Closing"/>
     <w:lsdException w:uiPriority="99" w:name="Signature"/>
-    <w:lsdException w:uiPriority="1" w:name="Default Paragraph Font"/>
-    <w:lsdException w:uiPriority="99" w:semiHidden="0" w:name="Body Text"/>
+    <w:lsdException w:qFormat="1" w:uiPriority="1" w:name="Default Paragraph Font"/>
+    <w:lsdException w:qFormat="1" w:uiPriority="99" w:semiHidden="0" w:name="Body Text"/>
     <w:lsdException w:uiPriority="99" w:name="Body Text Indent"/>
     <w:lsdException w:uiPriority="99" w:semiHidden="0" w:name="List Continue"/>
-    <w:lsdException w:uiPriority="99" w:semiHidden="0" w:name="List Continue 2"/>
-    <w:lsdException w:uiPriority="99" w:semiHidden="0" w:name="List Continue 3"/>
+    <w:lsdException w:qFormat="1" w:uiPriority="99" w:semiHidden="0" w:name="List Continue 2"/>
+    <w:lsdException w:qFormat="1" w:uiPriority="99" w:semiHidden="0" w:name="List Continue 3"/>
     <w:lsdException w:uiPriority="99" w:name="List Continue 4"/>
     <w:lsdException w:uiPriority="99" w:name="List Continue 5"/>
     <w:lsdException w:uiPriority="99" w:name="Message Header"/>
@@ -2008,8 +3140,8 @@
     <w:lsdException w:uiPriority="99" w:name="Body Text First Indent"/>
     <w:lsdException w:uiPriority="99" w:name="Body Text First Indent 2"/>
     <w:lsdException w:uiPriority="99" w:name="Note Heading"/>
-    <w:lsdException w:uiPriority="99" w:semiHidden="0" w:name="Body Text 2"/>
-    <w:lsdException w:uiPriority="99" w:semiHidden="0" w:name="Body Text 3"/>
+    <w:lsdException w:qFormat="1" w:uiPriority="99" w:semiHidden="0" w:name="Body Text 2"/>
+    <w:lsdException w:qFormat="1" w:uiPriority="99" w:semiHidden="0" w:name="Body Text 3"/>
     <w:lsdException w:uiPriority="99" w:name="Body Text Indent 2"/>
     <w:lsdException w:uiPriority="99" w:name="Body Text Indent 3"/>
     <w:lsdException w:uiPriority="99" w:name="Block Text"/>
@@ -2031,7 +3163,7 @@
     <w:lsdException w:uiPriority="99" w:name="HTML Sample"/>
     <w:lsdException w:uiPriority="99" w:name="HTML Typewriter"/>
     <w:lsdException w:uiPriority="99" w:name="HTML Variable"/>
-    <w:lsdException w:uiPriority="99" w:name="Normal Table"/>
+    <w:lsdException w:qFormat="1" w:uiPriority="99" w:name="Normal Table"/>
     <w:lsdException w:uiPriority="99" w:name="annotation subject"/>
     <w:lsdException w:uiPriority="99" w:name="Table Simple 1"/>
     <w:lsdException w:uiPriority="99" w:name="Table Simple 2"/>
@@ -2081,9 +3213,9 @@
     <w:lsdException w:qFormat="1" w:unhideWhenUsed="0" w:uiPriority="1" w:semiHidden="0" w:name="No Spacing"/>
     <w:lsdException w:unhideWhenUsed="0" w:uiPriority="60" w:semiHidden="0" w:name="Light Shading"/>
     <w:lsdException w:unhideWhenUsed="0" w:uiPriority="61" w:semiHidden="0" w:name="Light List"/>
-    <w:lsdException w:unhideWhenUsed="0" w:uiPriority="62" w:semiHidden="0" w:name="Light Grid"/>
+    <w:lsdException w:qFormat="1" w:unhideWhenUsed="0" w:uiPriority="62" w:semiHidden="0" w:name="Light Grid"/>
     <w:lsdException w:unhideWhenUsed="0" w:uiPriority="63" w:semiHidden="0" w:name="Medium Shading 1"/>
-    <w:lsdException w:unhideWhenUsed="0" w:uiPriority="64" w:semiHidden="0" w:name="Medium Shading 2"/>
+    <w:lsdException w:qFormat="1" w:unhideWhenUsed="0" w:uiPriority="64" w:semiHidden="0" w:name="Medium Shading 2"/>
     <w:lsdException w:unhideWhenUsed="0" w:uiPriority="65" w:semiHidden="0" w:name="Medium List 1"/>
     <w:lsdException w:qFormat="1" w:unhideWhenUsed="0" w:uiPriority="66" w:semiHidden="0" w:name="Medium List 2"/>
     <w:lsdException w:qFormat="1" w:unhideWhenUsed="0" w:uiPriority="67" w:semiHidden="0" w:name="Medium Grid 1"/>
@@ -2093,7 +3225,7 @@
     <w:lsdException w:qFormat="1" w:unhideWhenUsed="0" w:uiPriority="71" w:semiHidden="0" w:name="Colorful Shading"/>
     <w:lsdException w:unhideWhenUsed="0" w:uiPriority="72" w:semiHidden="0" w:name="Colorful List"/>
     <w:lsdException w:unhideWhenUsed="0" w:uiPriority="73" w:semiHidden="0" w:name="Colorful Grid"/>
-    <w:lsdException w:unhideWhenUsed="0" w:uiPriority="60" w:semiHidden="0" w:name="Light Shading Accent 1"/>
+    <w:lsdException w:qFormat="1" w:unhideWhenUsed="0" w:uiPriority="60" w:semiHidden="0" w:name="Light Shading Accent 1"/>
     <w:lsdException w:unhideWhenUsed="0" w:uiPriority="61" w:semiHidden="0" w:name="Light List Accent 1"/>
     <w:lsdException w:unhideWhenUsed="0" w:uiPriority="62" w:semiHidden="0" w:name="Light Grid Accent 1"/>
     <w:lsdException w:unhideWhenUsed="0" w:uiPriority="63" w:semiHidden="0" w:name="Medium Shading 1 Accent 1"/>
@@ -2110,11 +3242,11 @@
     <w:lsdException w:unhideWhenUsed="0" w:uiPriority="71" w:semiHidden="0" w:name="Colorful Shading Accent 1"/>
     <w:lsdException w:unhideWhenUsed="0" w:uiPriority="72" w:semiHidden="0" w:name="Colorful List Accent 1"/>
     <w:lsdException w:unhideWhenUsed="0" w:uiPriority="73" w:semiHidden="0" w:name="Colorful Grid Accent 1"/>
-    <w:lsdException w:unhideWhenUsed="0" w:uiPriority="60" w:semiHidden="0" w:name="Light Shading Accent 2"/>
+    <w:lsdException w:qFormat="1" w:unhideWhenUsed="0" w:uiPriority="60" w:semiHidden="0" w:name="Light Shading Accent 2"/>
     <w:lsdException w:unhideWhenUsed="0" w:uiPriority="61" w:semiHidden="0" w:name="Light List Accent 2"/>
-    <w:lsdException w:unhideWhenUsed="0" w:uiPriority="62" w:semiHidden="0" w:name="Light Grid Accent 2"/>
-    <w:lsdException w:unhideWhenUsed="0" w:uiPriority="63" w:semiHidden="0" w:name="Medium Shading 1 Accent 2"/>
-    <w:lsdException w:unhideWhenUsed="0" w:uiPriority="64" w:semiHidden="0" w:name="Medium Shading 2 Accent 2"/>
+    <w:lsdException w:qFormat="1" w:unhideWhenUsed="0" w:uiPriority="62" w:semiHidden="0" w:name="Light Grid Accent 2"/>
+    <w:lsdException w:qFormat="1" w:unhideWhenUsed="0" w:uiPriority="63" w:semiHidden="0" w:name="Medium Shading 1 Accent 2"/>
+    <w:lsdException w:qFormat="1" w:unhideWhenUsed="0" w:uiPriority="64" w:semiHidden="0" w:name="Medium Shading 2 Accent 2"/>
     <w:lsdException w:unhideWhenUsed="0" w:uiPriority="65" w:semiHidden="0" w:name="Medium List 1 Accent 2"/>
     <w:lsdException w:qFormat="1" w:unhideWhenUsed="0" w:uiPriority="66" w:semiHidden="0" w:name="Medium List 2 Accent 2"/>
     <w:lsdException w:qFormat="1" w:unhideWhenUsed="0" w:uiPriority="67" w:semiHidden="0" w:name="Medium Grid 1 Accent 2"/>
@@ -2124,11 +3256,11 @@
     <w:lsdException w:unhideWhenUsed="0" w:uiPriority="71" w:semiHidden="0" w:name="Colorful Shading Accent 2"/>
     <w:lsdException w:unhideWhenUsed="0" w:uiPriority="72" w:semiHidden="0" w:name="Colorful List Accent 2"/>
     <w:lsdException w:unhideWhenUsed="0" w:uiPriority="73" w:semiHidden="0" w:name="Colorful Grid Accent 2"/>
-    <w:lsdException w:unhideWhenUsed="0" w:uiPriority="60" w:semiHidden="0" w:name="Light Shading Accent 3"/>
-    <w:lsdException w:unhideWhenUsed="0" w:uiPriority="61" w:semiHidden="0" w:name="Light List Accent 3"/>
+    <w:lsdException w:qFormat="1" w:unhideWhenUsed="0" w:uiPriority="60" w:semiHidden="0" w:name="Light Shading Accent 3"/>
+    <w:lsdException w:qFormat="1" w:unhideWhenUsed="0" w:uiPriority="61" w:semiHidden="0" w:name="Light List Accent 3"/>
     <w:lsdException w:unhideWhenUsed="0" w:uiPriority="62" w:semiHidden="0" w:name="Light Grid Accent 3"/>
     <w:lsdException w:unhideWhenUsed="0" w:uiPriority="63" w:semiHidden="0" w:name="Medium Shading 1 Accent 3"/>
-    <w:lsdException w:unhideWhenUsed="0" w:uiPriority="64" w:semiHidden="0" w:name="Medium Shading 2 Accent 3"/>
+    <w:lsdException w:qFormat="1" w:unhideWhenUsed="0" w:uiPriority="64" w:semiHidden="0" w:name="Medium Shading 2 Accent 3"/>
     <w:lsdException w:unhideWhenUsed="0" w:uiPriority="65" w:semiHidden="0" w:name="Medium List 1 Accent 3"/>
     <w:lsdException w:qFormat="1" w:unhideWhenUsed="0" w:uiPriority="66" w:semiHidden="0" w:name="Medium List 2 Accent 3"/>
     <w:lsdException w:qFormat="1" w:unhideWhenUsed="0" w:uiPriority="67" w:semiHidden="0" w:name="Medium Grid 1 Accent 3"/>
@@ -2139,10 +3271,10 @@
     <w:lsdException w:unhideWhenUsed="0" w:uiPriority="72" w:semiHidden="0" w:name="Colorful List Accent 3"/>
     <w:lsdException w:unhideWhenUsed="0" w:uiPriority="73" w:semiHidden="0" w:name="Colorful Grid Accent 3"/>
     <w:lsdException w:unhideWhenUsed="0" w:uiPriority="60" w:semiHidden="0" w:name="Light Shading Accent 4"/>
-    <w:lsdException w:unhideWhenUsed="0" w:uiPriority="61" w:semiHidden="0" w:name="Light List Accent 4"/>
-    <w:lsdException w:unhideWhenUsed="0" w:uiPriority="62" w:semiHidden="0" w:name="Light Grid Accent 4"/>
+    <w:lsdException w:qFormat="1" w:unhideWhenUsed="0" w:uiPriority="61" w:semiHidden="0" w:name="Light List Accent 4"/>
+    <w:lsdException w:qFormat="1" w:unhideWhenUsed="0" w:uiPriority="62" w:semiHidden="0" w:name="Light Grid Accent 4"/>
     <w:lsdException w:unhideWhenUsed="0" w:uiPriority="63" w:semiHidden="0" w:name="Medium Shading 1 Accent 4"/>
-    <w:lsdException w:unhideWhenUsed="0" w:uiPriority="64" w:semiHidden="0" w:name="Medium Shading 2 Accent 4"/>
+    <w:lsdException w:qFormat="1" w:unhideWhenUsed="0" w:uiPriority="64" w:semiHidden="0" w:name="Medium Shading 2 Accent 4"/>
     <w:lsdException w:qFormat="1" w:unhideWhenUsed="0" w:uiPriority="65" w:semiHidden="0" w:name="Medium List 1 Accent 4"/>
     <w:lsdException w:qFormat="1" w:unhideWhenUsed="0" w:uiPriority="66" w:semiHidden="0" w:name="Medium List 2 Accent 4"/>
     <w:lsdException w:qFormat="1" w:unhideWhenUsed="0" w:uiPriority="67" w:semiHidden="0" w:name="Medium Grid 1 Accent 4"/>
@@ -2153,10 +3285,10 @@
     <w:lsdException w:unhideWhenUsed="0" w:uiPriority="72" w:semiHidden="0" w:name="Colorful List Accent 4"/>
     <w:lsdException w:unhideWhenUsed="0" w:uiPriority="73" w:semiHidden="0" w:name="Colorful Grid Accent 4"/>
     <w:lsdException w:unhideWhenUsed="0" w:uiPriority="60" w:semiHidden="0" w:name="Light Shading Accent 5"/>
-    <w:lsdException w:unhideWhenUsed="0" w:uiPriority="61" w:semiHidden="0" w:name="Light List Accent 5"/>
-    <w:lsdException w:unhideWhenUsed="0" w:uiPriority="62" w:semiHidden="0" w:name="Light Grid Accent 5"/>
-    <w:lsdException w:unhideWhenUsed="0" w:uiPriority="63" w:semiHidden="0" w:name="Medium Shading 1 Accent 5"/>
-    <w:lsdException w:unhideWhenUsed="0" w:uiPriority="64" w:semiHidden="0" w:name="Medium Shading 2 Accent 5"/>
+    <w:lsdException w:qFormat="1" w:unhideWhenUsed="0" w:uiPriority="61" w:semiHidden="0" w:name="Light List Accent 5"/>
+    <w:lsdException w:qFormat="1" w:unhideWhenUsed="0" w:uiPriority="62" w:semiHidden="0" w:name="Light Grid Accent 5"/>
+    <w:lsdException w:qFormat="1" w:unhideWhenUsed="0" w:uiPriority="63" w:semiHidden="0" w:name="Medium Shading 1 Accent 5"/>
+    <w:lsdException w:qFormat="1" w:unhideWhenUsed="0" w:uiPriority="64" w:semiHidden="0" w:name="Medium Shading 2 Accent 5"/>
     <w:lsdException w:qFormat="1" w:unhideWhenUsed="0" w:uiPriority="65" w:semiHidden="0" w:name="Medium List 1 Accent 5"/>
     <w:lsdException w:qFormat="1" w:unhideWhenUsed="0" w:uiPriority="66" w:semiHidden="0" w:name="Medium List 2 Accent 5"/>
     <w:lsdException w:qFormat="1" w:unhideWhenUsed="0" w:uiPriority="67" w:semiHidden="0" w:name="Medium Grid 1 Accent 5"/>
@@ -2166,11 +3298,11 @@
     <w:lsdException w:unhideWhenUsed="0" w:uiPriority="71" w:semiHidden="0" w:name="Colorful Shading Accent 5"/>
     <w:lsdException w:unhideWhenUsed="0" w:uiPriority="72" w:semiHidden="0" w:name="Colorful List Accent 5"/>
     <w:lsdException w:unhideWhenUsed="0" w:uiPriority="73" w:semiHidden="0" w:name="Colorful Grid Accent 5"/>
-    <w:lsdException w:unhideWhenUsed="0" w:uiPriority="60" w:semiHidden="0" w:name="Light Shading Accent 6"/>
-    <w:lsdException w:unhideWhenUsed="0" w:uiPriority="61" w:semiHidden="0" w:name="Light List Accent 6"/>
-    <w:lsdException w:unhideWhenUsed="0" w:uiPriority="62" w:semiHidden="0" w:name="Light Grid Accent 6"/>
-    <w:lsdException w:unhideWhenUsed="0" w:uiPriority="63" w:semiHidden="0" w:name="Medium Shading 1 Accent 6"/>
-    <w:lsdException w:unhideWhenUsed="0" w:uiPriority="64" w:semiHidden="0" w:name="Medium Shading 2 Accent 6"/>
+    <w:lsdException w:qFormat="1" w:unhideWhenUsed="0" w:uiPriority="60" w:semiHidden="0" w:name="Light Shading Accent 6"/>
+    <w:lsdException w:qFormat="1" w:unhideWhenUsed="0" w:uiPriority="61" w:semiHidden="0" w:name="Light List Accent 6"/>
+    <w:lsdException w:qFormat="1" w:unhideWhenUsed="0" w:uiPriority="62" w:semiHidden="0" w:name="Light Grid Accent 6"/>
+    <w:lsdException w:qFormat="1" w:unhideWhenUsed="0" w:uiPriority="63" w:semiHidden="0" w:name="Medium Shading 1 Accent 6"/>
+    <w:lsdException w:qFormat="1" w:unhideWhenUsed="0" w:uiPriority="64" w:semiHidden="0" w:name="Medium Shading 2 Accent 6"/>
     <w:lsdException w:qFormat="1" w:unhideWhenUsed="0" w:uiPriority="65" w:semiHidden="0" w:name="Medium List 1 Accent 6"/>
     <w:lsdException w:qFormat="1" w:unhideWhenUsed="0" w:uiPriority="66" w:semiHidden="0" w:name="Medium List 2 Accent 6"/>
     <w:lsdException w:qFormat="1" w:unhideWhenUsed="0" w:uiPriority="67" w:semiHidden="0" w:name="Medium Grid 1 Accent 6"/>
@@ -2435,12 +3567,14 @@
     <w:name w:val="Default Paragraph Font"/>
     <w:semiHidden/>
     <w:unhideWhenUsed/>
+    <w:qFormat/>
     <w:uiPriority w:val="1"/>
   </w:style>
   <w:style w:type="table" w:default="1" w:styleId="12">
     <w:name w:val="Normal Table"/>
     <w:semiHidden/>
     <w:unhideWhenUsed/>
+    <w:qFormat/>
     <w:uiPriority w:val="99"/>
     <w:tblPr>
       <w:tblCellMar>
@@ -2456,6 +3590,7 @@
     <w:basedOn w:val="1"/>
     <w:link w:val="144"/>
     <w:unhideWhenUsed/>
+    <w:qFormat/>
     <w:uiPriority w:val="99"/>
     <w:pPr>
       <w:spacing w:after="120"/>
@@ -2466,6 +3601,7 @@
     <w:basedOn w:val="1"/>
     <w:link w:val="145"/>
     <w:unhideWhenUsed/>
+    <w:qFormat/>
     <w:uiPriority w:val="99"/>
     <w:pPr>
       <w:spacing w:after="120" w:line="480" w:lineRule="auto"/>
@@ -2476,6 +3612,7 @@
     <w:basedOn w:val="1"/>
     <w:link w:val="146"/>
     <w:unhideWhenUsed/>
+    <w:qFormat/>
     <w:uiPriority w:val="99"/>
     <w:pPr>
       <w:spacing w:after="120"/>
@@ -2524,6 +3661,7 @@
     <w:basedOn w:val="1"/>
     <w:link w:val="136"/>
     <w:unhideWhenUsed/>
+    <w:qFormat/>
     <w:uiPriority w:val="99"/>
     <w:pPr>
       <w:tabs>
@@ -2552,6 +3690,7 @@
     <w:name w:val="List"/>
     <w:basedOn w:val="1"/>
     <w:unhideWhenUsed/>
+    <w:qFormat/>
     <w:uiPriority w:val="99"/>
     <w:pPr>
       <w:ind w:left="360" w:hanging="360"/>
@@ -2562,6 +3701,7 @@
     <w:name w:val="List 2"/>
     <w:basedOn w:val="1"/>
     <w:unhideWhenUsed/>
+    <w:qFormat/>
     <w:uiPriority w:val="99"/>
     <w:pPr>
       <w:ind w:left="720" w:hanging="360"/>
@@ -2572,6 +3712,7 @@
     <w:name w:val="List 3"/>
     <w:basedOn w:val="1"/>
     <w:unhideWhenUsed/>
+    <w:qFormat/>
     <w:uiPriority w:val="99"/>
     <w:pPr>
       <w:ind w:left="1080" w:hanging="360"/>
@@ -2582,6 +3723,7 @@
     <w:name w:val="List Bullet"/>
     <w:basedOn w:val="1"/>
     <w:unhideWhenUsed/>
+    <w:qFormat/>
     <w:uiPriority w:val="99"/>
     <w:pPr>
       <w:numPr>
@@ -2595,6 +3737,7 @@
     <w:name w:val="List Bullet 2"/>
     <w:basedOn w:val="1"/>
     <w:unhideWhenUsed/>
+    <w:qFormat/>
     <w:uiPriority w:val="99"/>
     <w:pPr>
       <w:numPr>
@@ -2608,6 +3751,7 @@
     <w:name w:val="List Bullet 3"/>
     <w:basedOn w:val="1"/>
     <w:unhideWhenUsed/>
+    <w:qFormat/>
     <w:uiPriority w:val="99"/>
     <w:pPr>
       <w:numPr>
@@ -2632,6 +3776,7 @@
     <w:name w:val="List Continue 2"/>
     <w:basedOn w:val="1"/>
     <w:unhideWhenUsed/>
+    <w:qFormat/>
     <w:uiPriority w:val="99"/>
     <w:pPr>
       <w:spacing w:after="120"/>
@@ -2643,6 +3788,7 @@
     <w:name w:val="List Continue 3"/>
     <w:basedOn w:val="1"/>
     <w:unhideWhenUsed/>
+    <w:qFormat/>
     <w:uiPriority w:val="99"/>
     <w:pPr>
       <w:spacing w:after="120"/>
@@ -2654,6 +3800,7 @@
     <w:name w:val="List Number"/>
     <w:basedOn w:val="1"/>
     <w:unhideWhenUsed/>
+    <w:qFormat/>
     <w:uiPriority w:val="99"/>
     <w:pPr>
       <w:numPr>
@@ -2667,6 +3814,7 @@
     <w:name w:val="List Number 2"/>
     <w:basedOn w:val="1"/>
     <w:unhideWhenUsed/>
+    <w:qFormat/>
     <w:uiPriority w:val="99"/>
     <w:pPr>
       <w:numPr>
@@ -2680,6 +3828,7 @@
     <w:name w:val="List Number 3"/>
     <w:basedOn w:val="1"/>
     <w:unhideWhenUsed/>
+    <w:qFormat/>
     <w:uiPriority w:val="99"/>
     <w:pPr>
       <w:numPr>
@@ -2894,6 +4043,7 @@
   <w:style w:type="table" w:styleId="38">
     <w:name w:val="Light Shading Accent 1"/>
     <w:basedOn w:val="12"/>
+    <w:qFormat/>
     <w:uiPriority w:val="60"/>
     <w:pPr>
       <w:spacing w:after="0" w:line="240" w:lineRule="auto"/>
@@ -2993,6 +4143,7 @@
   <w:style w:type="table" w:styleId="39">
     <w:name w:val="Light Shading Accent 2"/>
     <w:basedOn w:val="12"/>
+    <w:qFormat/>
     <w:uiPriority w:val="60"/>
     <w:pPr>
       <w:spacing w:after="0" w:line="240" w:lineRule="auto"/>
@@ -3092,6 +4243,7 @@
   <w:style w:type="table" w:styleId="40">
     <w:name w:val="Light Shading Accent 3"/>
     <w:basedOn w:val="12"/>
+    <w:qFormat/>
     <w:uiPriority w:val="60"/>
     <w:pPr>
       <w:spacing w:after="0" w:line="240" w:lineRule="auto"/>
@@ -3389,6 +4541,7 @@
   <w:style w:type="table" w:styleId="43">
     <w:name w:val="Light Shading Accent 6"/>
     <w:basedOn w:val="12"/>
+    <w:qFormat/>
     <w:uiPriority w:val="60"/>
     <w:pPr>
       <w:spacing w:after="0" w:line="240" w:lineRule="auto"/>
@@ -3767,6 +4920,7 @@
   <w:style w:type="table" w:styleId="47">
     <w:name w:val="Light List Accent 3"/>
     <w:basedOn w:val="12"/>
+    <w:qFormat/>
     <w:uiPriority w:val="61"/>
     <w:pPr>
       <w:spacing w:after="0" w:line="240" w:lineRule="auto"/>
@@ -3860,6 +5014,7 @@
   <w:style w:type="table" w:styleId="48">
     <w:name w:val="Light List Accent 4"/>
     <w:basedOn w:val="12"/>
+    <w:qFormat/>
     <w:uiPriority w:val="61"/>
     <w:pPr>
       <w:spacing w:after="0" w:line="240" w:lineRule="auto"/>
@@ -3953,6 +5108,7 @@
   <w:style w:type="table" w:styleId="49">
     <w:name w:val="Light List Accent 5"/>
     <w:basedOn w:val="12"/>
+    <w:qFormat/>
     <w:uiPriority w:val="61"/>
     <w:pPr>
       <w:spacing w:after="0" w:line="240" w:lineRule="auto"/>
@@ -4046,6 +5202,7 @@
   <w:style w:type="table" w:styleId="50">
     <w:name w:val="Light List Accent 6"/>
     <w:basedOn w:val="12"/>
+    <w:qFormat/>
     <w:uiPriority w:val="61"/>
     <w:pPr>
       <w:spacing w:after="0" w:line="240" w:lineRule="auto"/>
@@ -4139,6 +5296,7 @@
   <w:style w:type="table" w:styleId="51">
     <w:name w:val="Light Grid"/>
     <w:basedOn w:val="12"/>
+    <w:qFormat/>
     <w:uiPriority w:val="62"/>
     <w:pPr>
       <w:spacing w:after="0" w:line="240" w:lineRule="auto"/>
@@ -4391,6 +5549,7 @@
   <w:style w:type="table" w:styleId="53">
     <w:name w:val="Light Grid Accent 2"/>
     <w:basedOn w:val="12"/>
+    <w:qFormat/>
     <w:uiPriority w:val="62"/>
     <w:pPr>
       <w:spacing w:after="0" w:line="240" w:lineRule="auto"/>
@@ -4643,6 +5802,7 @@
   <w:style w:type="table" w:styleId="55">
     <w:name w:val="Light Grid Accent 4"/>
     <w:basedOn w:val="12"/>
+    <w:qFormat/>
     <w:uiPriority w:val="62"/>
     <w:pPr>
       <w:spacing w:after="0" w:line="240" w:lineRule="auto"/>
@@ -4769,6 +5929,7 @@
   <w:style w:type="table" w:styleId="56">
     <w:name w:val="Light Grid Accent 5"/>
     <w:basedOn w:val="12"/>
+    <w:qFormat/>
     <w:uiPriority w:val="62"/>
     <w:pPr>
       <w:spacing w:after="0" w:line="240" w:lineRule="auto"/>
@@ -4895,6 +6056,7 @@
   <w:style w:type="table" w:styleId="57">
     <w:name w:val="Light Grid Accent 6"/>
     <w:basedOn w:val="12"/>
+    <w:qFormat/>
     <w:uiPriority w:val="62"/>
     <w:pPr>
       <w:spacing w:after="0" w:line="240" w:lineRule="auto"/>
@@ -5235,6 +6397,7 @@
   <w:style w:type="table" w:styleId="60">
     <w:name w:val="Medium Shading 1 Accent 2"/>
     <w:basedOn w:val="12"/>
+    <w:qFormat/>
     <w:uiPriority w:val="63"/>
     <w:pPr>
       <w:spacing w:after="0" w:line="240" w:lineRule="auto"/>
@@ -5556,6 +6719,7 @@
   <w:style w:type="table" w:styleId="63">
     <w:name w:val="Medium Shading 1 Accent 5"/>
     <w:basedOn w:val="12"/>
+    <w:qFormat/>
     <w:uiPriority w:val="63"/>
     <w:pPr>
       <w:spacing w:after="0" w:line="240" w:lineRule="auto"/>
@@ -5663,6 +6827,7 @@
   <w:style w:type="table" w:styleId="64">
     <w:name w:val="Medium Shading 1 Accent 6"/>
     <w:basedOn w:val="12"/>
+    <w:qFormat/>
     <w:uiPriority w:val="63"/>
     <w:pPr>
       <w:spacing w:after="0" w:line="240" w:lineRule="auto"/>
@@ -5770,6 +6935,7 @@
   <w:style w:type="table" w:styleId="65">
     <w:name w:val="Medium Shading 2"/>
     <w:basedOn w:val="12"/>
+    <w:qFormat/>
     <w:uiPriority w:val="64"/>
     <w:pPr>
       <w:spacing w:after="0" w:line="240" w:lineRule="auto"/>
@@ -6100,6 +7266,7 @@
   <w:style w:type="table" w:styleId="67">
     <w:name w:val="Medium Shading 2 Accent 2"/>
     <w:basedOn w:val="12"/>
+    <w:qFormat/>
     <w:uiPriority w:val="64"/>
     <w:pPr>
       <w:spacing w:after="0" w:line="240" w:lineRule="auto"/>
@@ -6265,6 +7432,7 @@
   <w:style w:type="table" w:styleId="68">
     <w:name w:val="Medium Shading 2 Accent 3"/>
     <w:basedOn w:val="12"/>
+    <w:qFormat/>
     <w:uiPriority w:val="64"/>
     <w:pPr>
       <w:spacing w:after="0" w:line="240" w:lineRule="auto"/>
@@ -6430,6 +7598,7 @@
   <w:style w:type="table" w:styleId="69">
     <w:name w:val="Medium Shading 2 Accent 4"/>
     <w:basedOn w:val="12"/>
+    <w:qFormat/>
     <w:uiPriority w:val="64"/>
     <w:pPr>
       <w:spacing w:after="0" w:line="240" w:lineRule="auto"/>
@@ -6595,6 +7764,7 @@
   <w:style w:type="table" w:styleId="70">
     <w:name w:val="Medium Shading 2 Accent 5"/>
     <w:basedOn w:val="12"/>
+    <w:qFormat/>
     <w:uiPriority w:val="64"/>
     <w:pPr>
       <w:spacing w:after="0" w:line="240" w:lineRule="auto"/>
@@ -6760,6 +7930,7 @@
   <w:style w:type="table" w:styleId="71">
     <w:name w:val="Medium Shading 2 Accent 6"/>
     <w:basedOn w:val="12"/>
+    <w:qFormat/>
     <w:uiPriority w:val="64"/>
     <w:pPr>
       <w:spacing w:after="0" w:line="240" w:lineRule="auto"/>

</xml_diff>